<commit_message>
css reorganise presque completement
</commit_message>
<xml_diff>
--- a/about mtc.docx
+++ b/about mtc.docx
@@ -519,25 +519,7 @@
           <w:sz w:val="24"/>
           <w:szCs w:val="24"/>
         </w:rPr>
-        <w:t xml:space="preserve"> Mettre en place des solutions de sécurité pour protéger les données des clients contre les </w:t>
-      </w:r>
-      <w:proofErr w:type="spellStart"/>
-      <w:r>
-        <w:rPr>
-          <w:rFonts w:ascii="Times New Roman" w:eastAsia="Times New Roman" w:hAnsi="Times New Roman" w:cs="Times New Roman"/>
-          <w:sz w:val="24"/>
-          <w:szCs w:val="24"/>
-        </w:rPr>
-        <w:t>cybermenaces</w:t>
-      </w:r>
-      <w:proofErr w:type="spellEnd"/>
-      <w:r>
-        <w:rPr>
-          <w:rFonts w:ascii="Times New Roman" w:eastAsia="Times New Roman" w:hAnsi="Times New Roman" w:cs="Times New Roman"/>
-          <w:sz w:val="24"/>
-          <w:szCs w:val="24"/>
-        </w:rPr>
-        <w:t>.</w:t>
+        <w:t xml:space="preserve"> Mettre en place des solutions de sécurité pour protéger les données des clients contre les cybermenaces.</w:t>
       </w:r>
     </w:p>
     <w:p>
@@ -870,27 +852,7 @@
           <w:sz w:val="18"/>
           <w:szCs w:val="18"/>
         </w:rPr>
-        <w:t>"</w:t>
-      </w:r>
-      <w:proofErr w:type="spellStart"/>
-      <w:r>
-        <w:rPr>
-          <w:rFonts w:ascii="Consolas" w:eastAsia="Times New Roman" w:hAnsi="Consolas" w:cs="Times New Roman"/>
-          <w:color w:val="CE9178"/>
-          <w:sz w:val="18"/>
-          <w:szCs w:val="18"/>
-        </w:rPr>
-        <w:t>titleText</w:t>
-      </w:r>
-      <w:proofErr w:type="spellEnd"/>
-      <w:r>
-        <w:rPr>
-          <w:rFonts w:ascii="Consolas" w:eastAsia="Times New Roman" w:hAnsi="Consolas" w:cs="Times New Roman"/>
-          <w:color w:val="CE9178"/>
-          <w:sz w:val="18"/>
-          <w:szCs w:val="18"/>
-        </w:rPr>
-        <w:t>"</w:t>
+        <w:t>"titleText"</w:t>
       </w:r>
       <w:r>
         <w:rPr>
@@ -920,19 +882,8 @@
           <w:sz w:val="18"/>
           <w:szCs w:val="18"/>
         </w:rPr>
-        <w:t xml:space="preserve">                                                </w:t>
-      </w:r>
-      <w:proofErr w:type="spellStart"/>
-      <w:r>
-        <w:rPr>
-          <w:rFonts w:ascii="Consolas" w:eastAsia="Times New Roman" w:hAnsi="Consolas" w:cs="Times New Roman"/>
-          <w:color w:val="CCCCCC"/>
-          <w:sz w:val="18"/>
-          <w:szCs w:val="18"/>
-        </w:rPr>
-        <w:t>PRéSENTATION</w:t>
-      </w:r>
-      <w:proofErr w:type="spellEnd"/>
+        <w:t>                                                PRéSENTATION</w:t>
+      </w:r>
     </w:p>
     <w:p>
       <w:pPr>
@@ -1054,27 +1005,7 @@
           <w:sz w:val="18"/>
           <w:szCs w:val="18"/>
         </w:rPr>
-        <w:t>"</w:t>
-      </w:r>
-      <w:proofErr w:type="spellStart"/>
-      <w:r>
-        <w:rPr>
-          <w:rFonts w:ascii="Consolas" w:eastAsia="Times New Roman" w:hAnsi="Consolas" w:cs="Times New Roman"/>
-          <w:color w:val="CE9178"/>
-          <w:sz w:val="18"/>
-          <w:szCs w:val="18"/>
-        </w:rPr>
-        <w:t>titleText</w:t>
-      </w:r>
-      <w:proofErr w:type="spellEnd"/>
-      <w:r>
-        <w:rPr>
-          <w:rFonts w:ascii="Consolas" w:eastAsia="Times New Roman" w:hAnsi="Consolas" w:cs="Times New Roman"/>
-          <w:color w:val="CE9178"/>
-          <w:sz w:val="18"/>
-          <w:szCs w:val="18"/>
-        </w:rPr>
-        <w:t>"</w:t>
+        <w:t>"titleText"</w:t>
       </w:r>
       <w:r>
         <w:rPr>
@@ -1227,27 +1158,7 @@
           <w:sz w:val="18"/>
           <w:szCs w:val="18"/>
         </w:rPr>
-        <w:t>"</w:t>
-      </w:r>
-      <w:proofErr w:type="spellStart"/>
-      <w:r>
-        <w:rPr>
-          <w:rFonts w:ascii="Consolas" w:eastAsia="Times New Roman" w:hAnsi="Consolas" w:cs="Times New Roman"/>
-          <w:color w:val="CE9178"/>
-          <w:sz w:val="18"/>
-          <w:szCs w:val="18"/>
-        </w:rPr>
-        <w:t>titleText</w:t>
-      </w:r>
-      <w:proofErr w:type="spellEnd"/>
-      <w:r>
-        <w:rPr>
-          <w:rFonts w:ascii="Consolas" w:eastAsia="Times New Roman" w:hAnsi="Consolas" w:cs="Times New Roman"/>
-          <w:color w:val="CE9178"/>
-          <w:sz w:val="18"/>
-          <w:szCs w:val="18"/>
-        </w:rPr>
-        <w:t>"</w:t>
+        <w:t>"titleText"</w:t>
       </w:r>
       <w:r>
         <w:rPr>
@@ -1409,27 +1320,7 @@
           <w:sz w:val="18"/>
           <w:szCs w:val="18"/>
         </w:rPr>
-        <w:t>"</w:t>
-      </w:r>
-      <w:proofErr w:type="spellStart"/>
-      <w:r>
-        <w:rPr>
-          <w:rFonts w:ascii="Consolas" w:eastAsia="Times New Roman" w:hAnsi="Consolas" w:cs="Times New Roman"/>
-          <w:color w:val="CE9178"/>
-          <w:sz w:val="18"/>
-          <w:szCs w:val="18"/>
-        </w:rPr>
-        <w:t>titleText</w:t>
-      </w:r>
-      <w:proofErr w:type="spellEnd"/>
-      <w:r>
-        <w:rPr>
-          <w:rFonts w:ascii="Consolas" w:eastAsia="Times New Roman" w:hAnsi="Consolas" w:cs="Times New Roman"/>
-          <w:color w:val="CE9178"/>
-          <w:sz w:val="18"/>
-          <w:szCs w:val="18"/>
-        </w:rPr>
-        <w:t>"</w:t>
+        <w:t>"titleText"</w:t>
       </w:r>
       <w:r>
         <w:rPr>
@@ -1582,27 +1473,7 @@
           <w:sz w:val="18"/>
           <w:szCs w:val="18"/>
         </w:rPr>
-        <w:t>"</w:t>
-      </w:r>
-      <w:proofErr w:type="spellStart"/>
-      <w:r>
-        <w:rPr>
-          <w:rFonts w:ascii="Consolas" w:eastAsia="Times New Roman" w:hAnsi="Consolas" w:cs="Times New Roman"/>
-          <w:color w:val="CE9178"/>
-          <w:sz w:val="18"/>
-          <w:szCs w:val="18"/>
-        </w:rPr>
-        <w:t>titleText</w:t>
-      </w:r>
-      <w:proofErr w:type="spellEnd"/>
-      <w:r>
-        <w:rPr>
-          <w:rFonts w:ascii="Consolas" w:eastAsia="Times New Roman" w:hAnsi="Consolas" w:cs="Times New Roman"/>
-          <w:color w:val="CE9178"/>
-          <w:sz w:val="18"/>
-          <w:szCs w:val="18"/>
-        </w:rPr>
-        <w:t>"</w:t>
+        <w:t>"titleText"</w:t>
       </w:r>
       <w:r>
         <w:rPr>
@@ -1746,27 +1617,7 @@
           <w:sz w:val="18"/>
           <w:szCs w:val="18"/>
         </w:rPr>
-        <w:t xml:space="preserve">MTC-DIGIT est une entreprise qui </w:t>
-      </w:r>
-      <w:proofErr w:type="spellStart"/>
-      <w:r>
-        <w:rPr>
-          <w:rFonts w:ascii="Consolas" w:eastAsia="Times New Roman" w:hAnsi="Consolas" w:cs="Times New Roman"/>
-          <w:color w:val="6A9955"/>
-          <w:sz w:val="18"/>
-          <w:szCs w:val="18"/>
-        </w:rPr>
-        <w:t>oppère</w:t>
-      </w:r>
-      <w:proofErr w:type="spellEnd"/>
-      <w:r>
-        <w:rPr>
-          <w:rFonts w:ascii="Consolas" w:eastAsia="Times New Roman" w:hAnsi="Consolas" w:cs="Times New Roman"/>
-          <w:color w:val="6A9955"/>
-          <w:sz w:val="18"/>
-          <w:szCs w:val="18"/>
-        </w:rPr>
-        <w:t xml:space="preserve"> en plusieurs domaines entre la technologie et le digital.</w:t>
+        <w:t>MTC-DIGIT est une entreprise qui oppère en plusieurs domaines entre la technologie et le digital.</w:t>
       </w:r>
     </w:p>
     <w:p>
@@ -1787,29 +1638,7 @@
           <w:sz w:val="18"/>
           <w:szCs w:val="18"/>
         </w:rPr>
-        <w:t>                                &lt;</w:t>
-      </w:r>
-      <w:proofErr w:type="spellStart"/>
-      <w:proofErr w:type="gramStart"/>
-      <w:r>
-        <w:rPr>
-          <w:rFonts w:ascii="Consolas" w:eastAsia="Times New Roman" w:hAnsi="Consolas" w:cs="Times New Roman"/>
-          <w:color w:val="6A9955"/>
-          <w:sz w:val="18"/>
-          <w:szCs w:val="18"/>
-        </w:rPr>
-        <w:t>br</w:t>
-      </w:r>
-      <w:proofErr w:type="spellEnd"/>
-      <w:proofErr w:type="gramEnd"/>
-      <w:r>
-        <w:rPr>
-          <w:rFonts w:ascii="Consolas" w:eastAsia="Times New Roman" w:hAnsi="Consolas" w:cs="Times New Roman"/>
-          <w:color w:val="6A9955"/>
-          <w:sz w:val="18"/>
-          <w:szCs w:val="18"/>
-        </w:rPr>
-        <w:t>&gt;</w:t>
+        <w:t>                                &lt;br&gt;</w:t>
       </w:r>
     </w:p>
     <w:p>
@@ -1830,67 +1659,7 @@
           <w:sz w:val="18"/>
           <w:szCs w:val="18"/>
         </w:rPr>
-        <w:t xml:space="preserve">                                </w:t>
-      </w:r>
-      <w:proofErr w:type="gramStart"/>
-      <w:r>
-        <w:rPr>
-          <w:rFonts w:ascii="Consolas" w:eastAsia="Times New Roman" w:hAnsi="Consolas" w:cs="Times New Roman"/>
-          <w:color w:val="6A9955"/>
-          <w:sz w:val="18"/>
-          <w:szCs w:val="18"/>
-        </w:rPr>
-        <w:t>le</w:t>
-      </w:r>
-      <w:proofErr w:type="gramEnd"/>
-      <w:r>
-        <w:rPr>
-          <w:rFonts w:ascii="Consolas" w:eastAsia="Times New Roman" w:hAnsi="Consolas" w:cs="Times New Roman"/>
-          <w:color w:val="6A9955"/>
-          <w:sz w:val="18"/>
-          <w:szCs w:val="18"/>
-        </w:rPr>
-        <w:t xml:space="preserve"> </w:t>
-      </w:r>
-      <w:proofErr w:type="spellStart"/>
-      <w:r>
-        <w:rPr>
-          <w:rFonts w:ascii="Consolas" w:eastAsia="Times New Roman" w:hAnsi="Consolas" w:cs="Times New Roman"/>
-          <w:color w:val="6A9955"/>
-          <w:sz w:val="18"/>
-          <w:szCs w:val="18"/>
-        </w:rPr>
-        <w:t>therme</w:t>
-      </w:r>
-      <w:proofErr w:type="spellEnd"/>
-      <w:r>
-        <w:rPr>
-          <w:rFonts w:ascii="Consolas" w:eastAsia="Times New Roman" w:hAnsi="Consolas" w:cs="Times New Roman"/>
-          <w:color w:val="6A9955"/>
-          <w:sz w:val="18"/>
-          <w:szCs w:val="18"/>
-        </w:rPr>
-        <w:t xml:space="preserve"> MTC peut être défini comme Mix </w:t>
-      </w:r>
-      <w:proofErr w:type="spellStart"/>
-      <w:r>
-        <w:rPr>
-          <w:rFonts w:ascii="Consolas" w:eastAsia="Times New Roman" w:hAnsi="Consolas" w:cs="Times New Roman"/>
-          <w:color w:val="6A9955"/>
-          <w:sz w:val="18"/>
-          <w:szCs w:val="18"/>
-        </w:rPr>
-        <w:t>Technology</w:t>
-      </w:r>
-      <w:proofErr w:type="spellEnd"/>
-      <w:r>
-        <w:rPr>
-          <w:rFonts w:ascii="Consolas" w:eastAsia="Times New Roman" w:hAnsi="Consolas" w:cs="Times New Roman"/>
-          <w:color w:val="6A9955"/>
-          <w:sz w:val="18"/>
-          <w:szCs w:val="18"/>
-        </w:rPr>
-        <w:t xml:space="preserve"> Center. </w:t>
+        <w:t xml:space="preserve">                                le therme MTC peut être défini comme Mix Technology Center. </w:t>
       </w:r>
     </w:p>
     <w:p>
@@ -1932,47 +1701,2841 @@
           <w:sz w:val="18"/>
           <w:szCs w:val="18"/>
         </w:rPr>
-        <w:t xml:space="preserve">                                </w:t>
-      </w:r>
-      <w:proofErr w:type="gramStart"/>
-      <w:r>
-        <w:rPr>
-          <w:rFonts w:ascii="Consolas" w:eastAsia="Times New Roman" w:hAnsi="Consolas" w:cs="Times New Roman"/>
-          <w:color w:val="6A9955"/>
-          <w:sz w:val="18"/>
-          <w:szCs w:val="18"/>
-        </w:rPr>
-        <w:t>et</w:t>
-      </w:r>
-      <w:proofErr w:type="gramEnd"/>
-      <w:r>
-        <w:rPr>
-          <w:rFonts w:ascii="Consolas" w:eastAsia="Times New Roman" w:hAnsi="Consolas" w:cs="Times New Roman"/>
-          <w:color w:val="6A9955"/>
-          <w:sz w:val="18"/>
-          <w:szCs w:val="18"/>
-        </w:rPr>
-        <w:t xml:space="preserve"> d'autre part une </w:t>
-      </w:r>
-      <w:proofErr w:type="spellStart"/>
-      <w:r>
-        <w:rPr>
-          <w:rFonts w:ascii="Consolas" w:eastAsia="Times New Roman" w:hAnsi="Consolas" w:cs="Times New Roman"/>
-          <w:color w:val="6A9955"/>
-          <w:sz w:val="18"/>
-          <w:szCs w:val="18"/>
-        </w:rPr>
-        <w:t>coinsidence</w:t>
-      </w:r>
-      <w:proofErr w:type="spellEnd"/>
-      <w:r>
-        <w:rPr>
-          <w:rFonts w:ascii="Consolas" w:eastAsia="Times New Roman" w:hAnsi="Consolas" w:cs="Times New Roman"/>
-          <w:color w:val="6A9955"/>
-          <w:sz w:val="18"/>
-          <w:szCs w:val="18"/>
-        </w:rPr>
-        <w:t xml:space="preserve"> avec d'autres noms sur le web.</w:t>
+        <w:t>                                et d'autre part une coinsidence avec d'autres noms sur le web.</w:t>
+      </w:r>
+    </w:p>
+    <w:p>
+      <w:pPr>
+        <w:rPr>
+          <w:rFonts w:ascii="Times New Roman" w:eastAsia="Times New Roman" w:hAnsi="Times New Roman" w:cs="Times New Roman"/>
+          <w:sz w:val="24"/>
+          <w:szCs w:val="24"/>
+        </w:rPr>
+      </w:pPr>
+      <w:r>
+        <w:rPr>
+          <w:rFonts w:ascii="Times New Roman" w:eastAsia="Times New Roman" w:hAnsi="Times New Roman" w:cs="Times New Roman"/>
+          <w:sz w:val="24"/>
+          <w:szCs w:val="24"/>
+        </w:rPr>
+        <w:lastRenderedPageBreak/>
+        <w:br w:type="page"/>
+      </w:r>
+    </w:p>
+    <w:p>
+      <w:pPr>
+        <w:rPr>
+          <w:rFonts w:ascii="Times New Roman" w:eastAsia="Times New Roman" w:hAnsi="Times New Roman" w:cs="Times New Roman"/>
+          <w:sz w:val="24"/>
+          <w:szCs w:val="24"/>
+        </w:rPr>
+      </w:pPr>
+      <w:r>
+        <w:rPr>
+          <w:rFonts w:ascii="Times New Roman" w:eastAsia="Times New Roman" w:hAnsi="Times New Roman" w:cs="Times New Roman"/>
+          <w:sz w:val="24"/>
+          <w:szCs w:val="24"/>
+        </w:rPr>
+        <w:lastRenderedPageBreak/>
+        <w:br w:type="page"/>
+      </w:r>
+    </w:p>
+    <w:p>
+      <w:pPr>
+        <w:rPr>
+          <w:rFonts w:ascii="Times New Roman" w:eastAsia="Times New Roman" w:hAnsi="Times New Roman" w:cs="Times New Roman"/>
+          <w:sz w:val="24"/>
+          <w:szCs w:val="24"/>
+        </w:rPr>
+      </w:pPr>
+      <w:r>
+        <w:rPr>
+          <w:rFonts w:ascii="Times New Roman" w:eastAsia="Times New Roman" w:hAnsi="Times New Roman" w:cs="Times New Roman"/>
+          <w:sz w:val="24"/>
+          <w:szCs w:val="24"/>
+        </w:rPr>
+        <w:lastRenderedPageBreak/>
+        <w:br w:type="page"/>
+      </w:r>
+    </w:p>
+    <w:p>
+      <w:pPr>
+        <w:pStyle w:val="NormalWeb"/>
+      </w:pPr>
+      <w:r>
+        <w:lastRenderedPageBreak/>
+        <w:t xml:space="preserve">Très bon projet ! Tu veux un site simple mais fonctionnel pour présenter tes services. Voici un </w:t>
+      </w:r>
+      <w:r>
+        <w:rPr>
+          <w:rStyle w:val="lev"/>
+        </w:rPr>
+        <w:t>plan clair</w:t>
+      </w:r>
+      <w:r>
+        <w:t xml:space="preserve"> pour organiser le </w:t>
+      </w:r>
+      <w:r>
+        <w:rPr>
+          <w:rStyle w:val="lev"/>
+        </w:rPr>
+        <w:t>back-end</w:t>
+      </w:r>
+      <w:r>
+        <w:t xml:space="preserve">, les </w:t>
+      </w:r>
+      <w:r>
+        <w:rPr>
+          <w:rStyle w:val="lev"/>
+        </w:rPr>
+        <w:t>requêtes</w:t>
+      </w:r>
+      <w:r>
+        <w:t xml:space="preserve">, et le </w:t>
+      </w:r>
+      <w:r>
+        <w:rPr>
+          <w:rStyle w:val="lev"/>
+        </w:rPr>
+        <w:t>contenu de la base de données</w:t>
+      </w:r>
+      <w:r>
+        <w:t xml:space="preserve">, en utilisant </w:t>
+      </w:r>
+      <w:r>
+        <w:rPr>
+          <w:rStyle w:val="lev"/>
+        </w:rPr>
+        <w:t>Laravel</w:t>
+      </w:r>
+      <w:r>
+        <w:t xml:space="preserve"> comme framework (puisque tu es déjà dedans).</w:t>
+      </w:r>
+    </w:p>
+    <w:p>
+      <w:r>
+        <w:pict>
+          <v:rect id="_x0000_i1025" style="width:0;height:1.5pt" o:hralign="center" o:hrstd="t" o:hr="t" fillcolor="#a0a0a0" stroked="f"/>
+        </w:pict>
+      </w:r>
+    </w:p>
+    <w:p>
+      <w:pPr>
+        <w:pStyle w:val="Titre2"/>
+      </w:pPr>
+      <w:r>
+        <w:rPr>
+          <w:rFonts w:ascii="Cambria" w:hAnsi="Cambria" w:cs="Cambria"/>
+        </w:rPr>
+        <w:t>🔧</w:t>
+      </w:r>
+      <w:r>
+        <w:t xml:space="preserve"> 1. Objectif du site</w:t>
+      </w:r>
+    </w:p>
+    <w:p>
+      <w:pPr>
+        <w:pStyle w:val="NormalWeb"/>
+        <w:numPr>
+          <w:ilvl w:val="0"/>
+          <w:numId w:val="3"/>
+        </w:numPr>
+      </w:pPr>
+      <w:r>
+        <w:t xml:space="preserve">Présenter tes </w:t>
+      </w:r>
+      <w:r>
+        <w:rPr>
+          <w:rStyle w:val="lev"/>
+        </w:rPr>
+        <w:t>services</w:t>
+      </w:r>
+      <w:r>
+        <w:t xml:space="preserve"> (informatique, photographie, etc.)</w:t>
+      </w:r>
+    </w:p>
+    <w:p>
+      <w:pPr>
+        <w:pStyle w:val="NormalWeb"/>
+        <w:numPr>
+          <w:ilvl w:val="0"/>
+          <w:numId w:val="3"/>
+        </w:numPr>
+      </w:pPr>
+      <w:r>
+        <w:t xml:space="preserve">Afficher des </w:t>
+      </w:r>
+      <w:r>
+        <w:rPr>
+          <w:rStyle w:val="lev"/>
+        </w:rPr>
+        <w:t>réalisations ou projets</w:t>
+      </w:r>
+    </w:p>
+    <w:p>
+      <w:pPr>
+        <w:pStyle w:val="NormalWeb"/>
+        <w:numPr>
+          <w:ilvl w:val="0"/>
+          <w:numId w:val="3"/>
+        </w:numPr>
+      </w:pPr>
+      <w:r>
+        <w:t xml:space="preserve">Avoir un </w:t>
+      </w:r>
+      <w:r>
+        <w:rPr>
+          <w:rStyle w:val="lev"/>
+        </w:rPr>
+        <w:t>formulaire de contact</w:t>
+      </w:r>
+      <w:r>
+        <w:t xml:space="preserve"> (ou demande de devis)</w:t>
+      </w:r>
+    </w:p>
+    <w:p>
+      <w:pPr>
+        <w:pStyle w:val="NormalWeb"/>
+        <w:numPr>
+          <w:ilvl w:val="0"/>
+          <w:numId w:val="3"/>
+        </w:numPr>
+      </w:pPr>
+      <w:r>
+        <w:t>(Optionnel) Ajouter des témoignages ou avis clients</w:t>
+      </w:r>
+    </w:p>
+    <w:p>
+      <w:r>
+        <w:pict>
+          <v:rect id="_x0000_i1026" style="width:0;height:1.5pt" o:hralign="center" o:hrstd="t" o:hr="t" fillcolor="#a0a0a0" stroked="f"/>
+        </w:pict>
+      </w:r>
+    </w:p>
+    <w:p>
+      <w:pPr>
+        <w:pStyle w:val="Titre2"/>
+      </w:pPr>
+      <w:r>
+        <w:rPr>
+          <w:rFonts w:ascii="Cambria" w:hAnsi="Cambria" w:cs="Cambria"/>
+        </w:rPr>
+        <w:t>🧱</w:t>
+      </w:r>
+      <w:r>
+        <w:t xml:space="preserve"> 2. Structure de la base de données</w:t>
+      </w:r>
+    </w:p>
+    <w:p>
+      <w:pPr>
+        <w:pStyle w:val="NormalWeb"/>
+      </w:pPr>
+      <w:r>
+        <w:t xml:space="preserve">Voici une base </w:t>
+      </w:r>
+      <w:r>
+        <w:rPr>
+          <w:rStyle w:val="lev"/>
+        </w:rPr>
+        <w:t>simple et évolutive</w:t>
+      </w:r>
+      <w:r>
+        <w:t xml:space="preserve"> :</w:t>
+      </w:r>
+    </w:p>
+    <w:p>
+      <w:pPr>
+        <w:pStyle w:val="Titre3"/>
+      </w:pPr>
+      <w:r>
+        <w:t>📁 Tables principales :</w:t>
+      </w:r>
+    </w:p>
+    <w:p>
+      <w:pPr>
+        <w:pStyle w:val="Titre4"/>
+      </w:pPr>
+      <w:r>
+        <w:rPr>
+          <w:rStyle w:val="CodeHTML"/>
+        </w:rPr>
+        <w:t>services</w:t>
+      </w:r>
+    </w:p>
+    <w:tbl>
+      <w:tblPr>
+        <w:tblW w:w="0" w:type="auto"/>
+        <w:tblCellSpacing w:w="15" w:type="dxa"/>
+        <w:tblCellMar>
+          <w:top w:w="15" w:type="dxa"/>
+          <w:left w:w="15" w:type="dxa"/>
+          <w:bottom w:w="15" w:type="dxa"/>
+          <w:right w:w="15" w:type="dxa"/>
+        </w:tblCellMar>
+        <w:tblLook w:val="04A0"/>
+      </w:tblPr>
+      <w:tblGrid>
+        <w:gridCol w:w="248"/>
+        <w:gridCol w:w="1523"/>
+        <w:gridCol w:w="1733"/>
+        <w:gridCol w:w="1557"/>
+        <w:gridCol w:w="1065"/>
+      </w:tblGrid>
+      <w:tr>
+        <w:trPr>
+          <w:tblHeader/>
+          <w:tblCellSpacing w:w="15" w:type="dxa"/>
+        </w:trPr>
+        <w:tc>
+          <w:tcPr>
+            <w:tcW w:w="0" w:type="auto"/>
+            <w:vAlign w:val="center"/>
+            <w:hideMark/>
+          </w:tcPr>
+          <w:p>
+            <w:pPr>
+              <w:jc w:val="center"/>
+              <w:rPr>
+                <w:b/>
+                <w:bCs/>
+                <w:sz w:val="24"/>
+                <w:szCs w:val="24"/>
+              </w:rPr>
+            </w:pPr>
+            <w:r>
+              <w:rPr>
+                <w:b/>
+                <w:bCs/>
+              </w:rPr>
+              <w:t>id</w:t>
+            </w:r>
+          </w:p>
+        </w:tc>
+        <w:tc>
+          <w:tcPr>
+            <w:tcW w:w="0" w:type="auto"/>
+            <w:vAlign w:val="center"/>
+            <w:hideMark/>
+          </w:tcPr>
+          <w:p>
+            <w:pPr>
+              <w:jc w:val="center"/>
+              <w:rPr>
+                <w:b/>
+                <w:bCs/>
+                <w:sz w:val="24"/>
+                <w:szCs w:val="24"/>
+              </w:rPr>
+            </w:pPr>
+            <w:r>
+              <w:rPr>
+                <w:b/>
+                <w:bCs/>
+              </w:rPr>
+              <w:t>titre</w:t>
+            </w:r>
+          </w:p>
+        </w:tc>
+        <w:tc>
+          <w:tcPr>
+            <w:tcW w:w="0" w:type="auto"/>
+            <w:vAlign w:val="center"/>
+            <w:hideMark/>
+          </w:tcPr>
+          <w:p>
+            <w:pPr>
+              <w:jc w:val="center"/>
+              <w:rPr>
+                <w:b/>
+                <w:bCs/>
+                <w:sz w:val="24"/>
+                <w:szCs w:val="24"/>
+              </w:rPr>
+            </w:pPr>
+            <w:r>
+              <w:rPr>
+                <w:b/>
+                <w:bCs/>
+              </w:rPr>
+              <w:t>description</w:t>
+            </w:r>
+          </w:p>
+        </w:tc>
+        <w:tc>
+          <w:tcPr>
+            <w:tcW w:w="0" w:type="auto"/>
+            <w:vAlign w:val="center"/>
+            <w:hideMark/>
+          </w:tcPr>
+          <w:p>
+            <w:pPr>
+              <w:jc w:val="center"/>
+              <w:rPr>
+                <w:b/>
+                <w:bCs/>
+                <w:sz w:val="24"/>
+                <w:szCs w:val="24"/>
+              </w:rPr>
+            </w:pPr>
+            <w:r>
+              <w:rPr>
+                <w:b/>
+                <w:bCs/>
+              </w:rPr>
+              <w:t>image_path</w:t>
+            </w:r>
+          </w:p>
+        </w:tc>
+        <w:tc>
+          <w:tcPr>
+            <w:tcW w:w="0" w:type="auto"/>
+            <w:vAlign w:val="center"/>
+            <w:hideMark/>
+          </w:tcPr>
+          <w:p>
+            <w:pPr>
+              <w:jc w:val="center"/>
+              <w:rPr>
+                <w:b/>
+                <w:bCs/>
+                <w:sz w:val="24"/>
+                <w:szCs w:val="24"/>
+              </w:rPr>
+            </w:pPr>
+            <w:r>
+              <w:rPr>
+                <w:b/>
+                <w:bCs/>
+              </w:rPr>
+              <w:t>created_at</w:t>
+            </w:r>
+          </w:p>
+        </w:tc>
+      </w:tr>
+      <w:tr>
+        <w:trPr>
+          <w:tblCellSpacing w:w="15" w:type="dxa"/>
+        </w:trPr>
+        <w:tc>
+          <w:tcPr>
+            <w:tcW w:w="0" w:type="auto"/>
+            <w:vAlign w:val="center"/>
+            <w:hideMark/>
+          </w:tcPr>
+          <w:p>
+            <w:pPr>
+              <w:rPr>
+                <w:sz w:val="24"/>
+                <w:szCs w:val="24"/>
+              </w:rPr>
+            </w:pPr>
+            <w:r>
+              <w:t>1</w:t>
+            </w:r>
+          </w:p>
+        </w:tc>
+        <w:tc>
+          <w:tcPr>
+            <w:tcW w:w="0" w:type="auto"/>
+            <w:vAlign w:val="center"/>
+            <w:hideMark/>
+          </w:tcPr>
+          <w:p>
+            <w:pPr>
+              <w:rPr>
+                <w:sz w:val="24"/>
+                <w:szCs w:val="24"/>
+              </w:rPr>
+            </w:pPr>
+            <w:r>
+              <w:t>Maintenance PC</w:t>
+            </w:r>
+          </w:p>
+        </w:tc>
+        <w:tc>
+          <w:tcPr>
+            <w:tcW w:w="0" w:type="auto"/>
+            <w:vAlign w:val="center"/>
+            <w:hideMark/>
+          </w:tcPr>
+          <w:p>
+            <w:pPr>
+              <w:rPr>
+                <w:sz w:val="24"/>
+                <w:szCs w:val="24"/>
+              </w:rPr>
+            </w:pPr>
+            <w:r>
+              <w:t>Réparation et suivi</w:t>
+            </w:r>
+          </w:p>
+        </w:tc>
+        <w:tc>
+          <w:tcPr>
+            <w:tcW w:w="0" w:type="auto"/>
+            <w:vAlign w:val="center"/>
+            <w:hideMark/>
+          </w:tcPr>
+          <w:p>
+            <w:pPr>
+              <w:rPr>
+                <w:sz w:val="24"/>
+                <w:szCs w:val="24"/>
+              </w:rPr>
+            </w:pPr>
+            <w:r>
+              <w:t>maintenance.jpg</w:t>
+            </w:r>
+          </w:p>
+        </w:tc>
+        <w:tc>
+          <w:tcPr>
+            <w:tcW w:w="0" w:type="auto"/>
+            <w:vAlign w:val="center"/>
+            <w:hideMark/>
+          </w:tcPr>
+          <w:p>
+            <w:pPr>
+              <w:rPr>
+                <w:sz w:val="24"/>
+                <w:szCs w:val="24"/>
+              </w:rPr>
+            </w:pPr>
+            <w:r>
+              <w:t>...</w:t>
+            </w:r>
+          </w:p>
+        </w:tc>
+      </w:tr>
+    </w:tbl>
+    <w:p>
+      <w:pPr>
+        <w:pStyle w:val="Titre4"/>
+      </w:pPr>
+      <w:r>
+        <w:rPr>
+          <w:rStyle w:val="CodeHTML"/>
+        </w:rPr>
+        <w:t>projects</w:t>
+      </w:r>
+    </w:p>
+    <w:tbl>
+      <w:tblPr>
+        <w:tblW w:w="0" w:type="auto"/>
+        <w:tblCellSpacing w:w="15" w:type="dxa"/>
+        <w:tblCellMar>
+          <w:top w:w="15" w:type="dxa"/>
+          <w:left w:w="15" w:type="dxa"/>
+          <w:bottom w:w="15" w:type="dxa"/>
+          <w:right w:w="15" w:type="dxa"/>
+        </w:tblCellMar>
+        <w:tblLook w:val="04A0"/>
+      </w:tblPr>
+      <w:tblGrid>
+        <w:gridCol w:w="248"/>
+        <w:gridCol w:w="1919"/>
+        <w:gridCol w:w="1774"/>
+        <w:gridCol w:w="1148"/>
+        <w:gridCol w:w="980"/>
+        <w:gridCol w:w="1065"/>
+      </w:tblGrid>
+      <w:tr>
+        <w:trPr>
+          <w:tblHeader/>
+          <w:tblCellSpacing w:w="15" w:type="dxa"/>
+        </w:trPr>
+        <w:tc>
+          <w:tcPr>
+            <w:tcW w:w="0" w:type="auto"/>
+            <w:vAlign w:val="center"/>
+            <w:hideMark/>
+          </w:tcPr>
+          <w:p>
+            <w:pPr>
+              <w:jc w:val="center"/>
+              <w:rPr>
+                <w:b/>
+                <w:bCs/>
+                <w:sz w:val="24"/>
+                <w:szCs w:val="24"/>
+              </w:rPr>
+            </w:pPr>
+            <w:r>
+              <w:rPr>
+                <w:b/>
+                <w:bCs/>
+              </w:rPr>
+              <w:t>id</w:t>
+            </w:r>
+          </w:p>
+        </w:tc>
+        <w:tc>
+          <w:tcPr>
+            <w:tcW w:w="0" w:type="auto"/>
+            <w:vAlign w:val="center"/>
+            <w:hideMark/>
+          </w:tcPr>
+          <w:p>
+            <w:pPr>
+              <w:jc w:val="center"/>
+              <w:rPr>
+                <w:b/>
+                <w:bCs/>
+                <w:sz w:val="24"/>
+                <w:szCs w:val="24"/>
+              </w:rPr>
+            </w:pPr>
+            <w:r>
+              <w:rPr>
+                <w:b/>
+                <w:bCs/>
+              </w:rPr>
+              <w:t>titre</w:t>
+            </w:r>
+          </w:p>
+        </w:tc>
+        <w:tc>
+          <w:tcPr>
+            <w:tcW w:w="0" w:type="auto"/>
+            <w:vAlign w:val="center"/>
+            <w:hideMark/>
+          </w:tcPr>
+          <w:p>
+            <w:pPr>
+              <w:jc w:val="center"/>
+              <w:rPr>
+                <w:b/>
+                <w:bCs/>
+                <w:sz w:val="24"/>
+                <w:szCs w:val="24"/>
+              </w:rPr>
+            </w:pPr>
+            <w:r>
+              <w:rPr>
+                <w:b/>
+                <w:bCs/>
+              </w:rPr>
+              <w:t>description</w:t>
+            </w:r>
+          </w:p>
+        </w:tc>
+        <w:tc>
+          <w:tcPr>
+            <w:tcW w:w="0" w:type="auto"/>
+            <w:vAlign w:val="center"/>
+            <w:hideMark/>
+          </w:tcPr>
+          <w:p>
+            <w:pPr>
+              <w:jc w:val="center"/>
+              <w:rPr>
+                <w:b/>
+                <w:bCs/>
+                <w:sz w:val="24"/>
+                <w:szCs w:val="24"/>
+              </w:rPr>
+            </w:pPr>
+            <w:r>
+              <w:rPr>
+                <w:b/>
+                <w:bCs/>
+              </w:rPr>
+              <w:t>image_path</w:t>
+            </w:r>
+          </w:p>
+        </w:tc>
+        <w:tc>
+          <w:tcPr>
+            <w:tcW w:w="0" w:type="auto"/>
+            <w:vAlign w:val="center"/>
+            <w:hideMark/>
+          </w:tcPr>
+          <w:p>
+            <w:pPr>
+              <w:jc w:val="center"/>
+              <w:rPr>
+                <w:b/>
+                <w:bCs/>
+                <w:sz w:val="24"/>
+                <w:szCs w:val="24"/>
+              </w:rPr>
+            </w:pPr>
+            <w:r>
+              <w:rPr>
+                <w:b/>
+                <w:bCs/>
+              </w:rPr>
+              <w:t>service_id</w:t>
+            </w:r>
+          </w:p>
+        </w:tc>
+        <w:tc>
+          <w:tcPr>
+            <w:tcW w:w="0" w:type="auto"/>
+            <w:vAlign w:val="center"/>
+            <w:hideMark/>
+          </w:tcPr>
+          <w:p>
+            <w:pPr>
+              <w:jc w:val="center"/>
+              <w:rPr>
+                <w:b/>
+                <w:bCs/>
+                <w:sz w:val="24"/>
+                <w:szCs w:val="24"/>
+              </w:rPr>
+            </w:pPr>
+            <w:r>
+              <w:rPr>
+                <w:b/>
+                <w:bCs/>
+              </w:rPr>
+              <w:t>created_at</w:t>
+            </w:r>
+          </w:p>
+        </w:tc>
+      </w:tr>
+      <w:tr>
+        <w:trPr>
+          <w:tblCellSpacing w:w="15" w:type="dxa"/>
+        </w:trPr>
+        <w:tc>
+          <w:tcPr>
+            <w:tcW w:w="0" w:type="auto"/>
+            <w:vAlign w:val="center"/>
+            <w:hideMark/>
+          </w:tcPr>
+          <w:p>
+            <w:pPr>
+              <w:rPr>
+                <w:sz w:val="24"/>
+                <w:szCs w:val="24"/>
+              </w:rPr>
+            </w:pPr>
+            <w:r>
+              <w:t>1</w:t>
+            </w:r>
+          </w:p>
+        </w:tc>
+        <w:tc>
+          <w:tcPr>
+            <w:tcW w:w="0" w:type="auto"/>
+            <w:vAlign w:val="center"/>
+            <w:hideMark/>
+          </w:tcPr>
+          <w:p>
+            <w:pPr>
+              <w:rPr>
+                <w:sz w:val="24"/>
+                <w:szCs w:val="24"/>
+              </w:rPr>
+            </w:pPr>
+            <w:r>
+              <w:t>Mariage Yao &amp; Aïcha</w:t>
+            </w:r>
+          </w:p>
+        </w:tc>
+        <w:tc>
+          <w:tcPr>
+            <w:tcW w:w="0" w:type="auto"/>
+            <w:vAlign w:val="center"/>
+            <w:hideMark/>
+          </w:tcPr>
+          <w:p>
+            <w:pPr>
+              <w:rPr>
+                <w:sz w:val="24"/>
+                <w:szCs w:val="24"/>
+              </w:rPr>
+            </w:pPr>
+            <w:r>
+              <w:t>Reportage complet</w:t>
+            </w:r>
+          </w:p>
+        </w:tc>
+        <w:tc>
+          <w:tcPr>
+            <w:tcW w:w="0" w:type="auto"/>
+            <w:vAlign w:val="center"/>
+            <w:hideMark/>
+          </w:tcPr>
+          <w:p>
+            <w:pPr>
+              <w:rPr>
+                <w:sz w:val="24"/>
+                <w:szCs w:val="24"/>
+              </w:rPr>
+            </w:pPr>
+            <w:r>
+              <w:t>mariage.jpg</w:t>
+            </w:r>
+          </w:p>
+        </w:tc>
+        <w:tc>
+          <w:tcPr>
+            <w:tcW w:w="0" w:type="auto"/>
+            <w:vAlign w:val="center"/>
+            <w:hideMark/>
+          </w:tcPr>
+          <w:p>
+            <w:pPr>
+              <w:rPr>
+                <w:sz w:val="24"/>
+                <w:szCs w:val="24"/>
+              </w:rPr>
+            </w:pPr>
+            <w:r>
+              <w:t>2 (photo)</w:t>
+            </w:r>
+          </w:p>
+        </w:tc>
+        <w:tc>
+          <w:tcPr>
+            <w:tcW w:w="0" w:type="auto"/>
+            <w:vAlign w:val="center"/>
+            <w:hideMark/>
+          </w:tcPr>
+          <w:p>
+            <w:pPr>
+              <w:rPr>
+                <w:sz w:val="24"/>
+                <w:szCs w:val="24"/>
+              </w:rPr>
+            </w:pPr>
+            <w:r>
+              <w:t>...</w:t>
+            </w:r>
+          </w:p>
+        </w:tc>
+      </w:tr>
+    </w:tbl>
+    <w:p>
+      <w:pPr>
+        <w:pStyle w:val="Titre4"/>
+      </w:pPr>
+      <w:r>
+        <w:rPr>
+          <w:rStyle w:val="CodeHTML"/>
+        </w:rPr>
+        <w:t>contacts</w:t>
+      </w:r>
+    </w:p>
+    <w:tbl>
+      <w:tblPr>
+        <w:tblW w:w="0" w:type="auto"/>
+        <w:tblCellSpacing w:w="15" w:type="dxa"/>
+        <w:tblCellMar>
+          <w:top w:w="15" w:type="dxa"/>
+          <w:left w:w="15" w:type="dxa"/>
+          <w:bottom w:w="15" w:type="dxa"/>
+          <w:right w:w="15" w:type="dxa"/>
+        </w:tblCellMar>
+        <w:tblLook w:val="04A0"/>
+      </w:tblPr>
+      <w:tblGrid>
+        <w:gridCol w:w="248"/>
+        <w:gridCol w:w="476"/>
+        <w:gridCol w:w="1846"/>
+        <w:gridCol w:w="2485"/>
+        <w:gridCol w:w="1065"/>
+      </w:tblGrid>
+      <w:tr>
+        <w:trPr>
+          <w:tblHeader/>
+          <w:tblCellSpacing w:w="15" w:type="dxa"/>
+        </w:trPr>
+        <w:tc>
+          <w:tcPr>
+            <w:tcW w:w="0" w:type="auto"/>
+            <w:vAlign w:val="center"/>
+            <w:hideMark/>
+          </w:tcPr>
+          <w:p>
+            <w:pPr>
+              <w:jc w:val="center"/>
+              <w:rPr>
+                <w:b/>
+                <w:bCs/>
+                <w:sz w:val="24"/>
+                <w:szCs w:val="24"/>
+              </w:rPr>
+            </w:pPr>
+            <w:r>
+              <w:rPr>
+                <w:b/>
+                <w:bCs/>
+              </w:rPr>
+              <w:t>id</w:t>
+            </w:r>
+          </w:p>
+        </w:tc>
+        <w:tc>
+          <w:tcPr>
+            <w:tcW w:w="0" w:type="auto"/>
+            <w:vAlign w:val="center"/>
+            <w:hideMark/>
+          </w:tcPr>
+          <w:p>
+            <w:pPr>
+              <w:jc w:val="center"/>
+              <w:rPr>
+                <w:b/>
+                <w:bCs/>
+                <w:sz w:val="24"/>
+                <w:szCs w:val="24"/>
+              </w:rPr>
+            </w:pPr>
+            <w:r>
+              <w:rPr>
+                <w:b/>
+                <w:bCs/>
+              </w:rPr>
+              <w:t>nom</w:t>
+            </w:r>
+          </w:p>
+        </w:tc>
+        <w:tc>
+          <w:tcPr>
+            <w:tcW w:w="0" w:type="auto"/>
+            <w:vAlign w:val="center"/>
+            <w:hideMark/>
+          </w:tcPr>
+          <w:p>
+            <w:pPr>
+              <w:jc w:val="center"/>
+              <w:rPr>
+                <w:b/>
+                <w:bCs/>
+                <w:sz w:val="24"/>
+                <w:szCs w:val="24"/>
+              </w:rPr>
+            </w:pPr>
+            <w:r>
+              <w:rPr>
+                <w:b/>
+                <w:bCs/>
+              </w:rPr>
+              <w:t>email</w:t>
+            </w:r>
+          </w:p>
+        </w:tc>
+        <w:tc>
+          <w:tcPr>
+            <w:tcW w:w="0" w:type="auto"/>
+            <w:vAlign w:val="center"/>
+            <w:hideMark/>
+          </w:tcPr>
+          <w:p>
+            <w:pPr>
+              <w:jc w:val="center"/>
+              <w:rPr>
+                <w:b/>
+                <w:bCs/>
+                <w:sz w:val="24"/>
+                <w:szCs w:val="24"/>
+              </w:rPr>
+            </w:pPr>
+            <w:r>
+              <w:rPr>
+                <w:b/>
+                <w:bCs/>
+              </w:rPr>
+              <w:t>message</w:t>
+            </w:r>
+          </w:p>
+        </w:tc>
+        <w:tc>
+          <w:tcPr>
+            <w:tcW w:w="0" w:type="auto"/>
+            <w:vAlign w:val="center"/>
+            <w:hideMark/>
+          </w:tcPr>
+          <w:p>
+            <w:pPr>
+              <w:jc w:val="center"/>
+              <w:rPr>
+                <w:b/>
+                <w:bCs/>
+                <w:sz w:val="24"/>
+                <w:szCs w:val="24"/>
+              </w:rPr>
+            </w:pPr>
+            <w:r>
+              <w:rPr>
+                <w:b/>
+                <w:bCs/>
+              </w:rPr>
+              <w:t>created_at</w:t>
+            </w:r>
+          </w:p>
+        </w:tc>
+      </w:tr>
+      <w:tr>
+        <w:trPr>
+          <w:tblCellSpacing w:w="15" w:type="dxa"/>
+        </w:trPr>
+        <w:tc>
+          <w:tcPr>
+            <w:tcW w:w="0" w:type="auto"/>
+            <w:vAlign w:val="center"/>
+            <w:hideMark/>
+          </w:tcPr>
+          <w:p>
+            <w:pPr>
+              <w:rPr>
+                <w:sz w:val="24"/>
+                <w:szCs w:val="24"/>
+              </w:rPr>
+            </w:pPr>
+            <w:r>
+              <w:t>1</w:t>
+            </w:r>
+          </w:p>
+        </w:tc>
+        <w:tc>
+          <w:tcPr>
+            <w:tcW w:w="0" w:type="auto"/>
+            <w:vAlign w:val="center"/>
+            <w:hideMark/>
+          </w:tcPr>
+          <w:p>
+            <w:pPr>
+              <w:rPr>
+                <w:sz w:val="24"/>
+                <w:szCs w:val="24"/>
+              </w:rPr>
+            </w:pPr>
+            <w:r>
+              <w:t>Jean</w:t>
+            </w:r>
+          </w:p>
+        </w:tc>
+        <w:tc>
+          <w:tcPr>
+            <w:tcW w:w="0" w:type="auto"/>
+            <w:vAlign w:val="center"/>
+            <w:hideMark/>
+          </w:tcPr>
+          <w:p>
+            <w:pPr>
+              <w:rPr>
+                <w:sz w:val="24"/>
+                <w:szCs w:val="24"/>
+              </w:rPr>
+            </w:pPr>
+            <w:r>
+              <w:t>jean@exemple.com</w:t>
+            </w:r>
+          </w:p>
+        </w:tc>
+        <w:tc>
+          <w:tcPr>
+            <w:tcW w:w="0" w:type="auto"/>
+            <w:vAlign w:val="center"/>
+            <w:hideMark/>
+          </w:tcPr>
+          <w:p>
+            <w:pPr>
+              <w:rPr>
+                <w:sz w:val="24"/>
+                <w:szCs w:val="24"/>
+              </w:rPr>
+            </w:pPr>
+            <w:r>
+              <w:t>Je veux un site web simple.</w:t>
+            </w:r>
+          </w:p>
+        </w:tc>
+        <w:tc>
+          <w:tcPr>
+            <w:tcW w:w="0" w:type="auto"/>
+            <w:vAlign w:val="center"/>
+            <w:hideMark/>
+          </w:tcPr>
+          <w:p>
+            <w:pPr>
+              <w:rPr>
+                <w:sz w:val="24"/>
+                <w:szCs w:val="24"/>
+              </w:rPr>
+            </w:pPr>
+            <w:r>
+              <w:t>...</w:t>
+            </w:r>
+          </w:p>
+        </w:tc>
+      </w:tr>
+    </w:tbl>
+    <w:p>
+      <w:r>
+        <w:pict>
+          <v:rect id="_x0000_i1027" style="width:0;height:1.5pt" o:hralign="center" o:hrstd="t" o:hr="t" fillcolor="#a0a0a0" stroked="f"/>
+        </w:pict>
+      </w:r>
+    </w:p>
+    <w:p>
+      <w:pPr>
+        <w:pStyle w:val="Titre2"/>
+      </w:pPr>
+      <w:r>
+        <w:rPr>
+          <w:rFonts w:ascii="Cambria" w:hAnsi="Cambria" w:cs="Cambria"/>
+        </w:rPr>
+        <w:t>⚙️</w:t>
+      </w:r>
+      <w:r>
+        <w:t xml:space="preserve"> 3. Backend Laravel</w:t>
+      </w:r>
+    </w:p>
+    <w:p>
+      <w:pPr>
+        <w:pStyle w:val="Titre3"/>
+      </w:pPr>
+      <w:r>
+        <w:t>✅ Commandes à lancer pour les modèles :</w:t>
+      </w:r>
+    </w:p>
+    <w:p>
+      <w:pPr>
+        <w:pStyle w:val="PrformatHTML"/>
+      </w:pPr>
+      <w:r>
+        <w:t>bash</w:t>
+      </w:r>
+    </w:p>
+    <w:p>
+      <w:pPr>
+        <w:pStyle w:val="PrformatHTML"/>
+      </w:pPr>
+      <w:r>
+        <w:t>CopierModifier</w:t>
+      </w:r>
+    </w:p>
+    <w:p>
+      <w:pPr>
+        <w:pStyle w:val="PrformatHTML"/>
+        <w:rPr>
+          <w:rStyle w:val="CodeHTML"/>
+        </w:rPr>
+      </w:pPr>
+      <w:r>
+        <w:rPr>
+          <w:rStyle w:val="CodeHTML"/>
+        </w:rPr>
+        <w:t>php artisan make:model Service -mcr</w:t>
+      </w:r>
+    </w:p>
+    <w:p>
+      <w:pPr>
+        <w:pStyle w:val="PrformatHTML"/>
+        <w:rPr>
+          <w:rStyle w:val="CodeHTML"/>
+        </w:rPr>
+      </w:pPr>
+      <w:r>
+        <w:rPr>
+          <w:rStyle w:val="CodeHTML"/>
+        </w:rPr>
+        <w:lastRenderedPageBreak/>
+        <w:t>php artisan make:model Project -mcr</w:t>
+      </w:r>
+    </w:p>
+    <w:p>
+      <w:pPr>
+        <w:pStyle w:val="PrformatHTML"/>
+        <w:rPr>
+          <w:rStyle w:val="CodeHTML"/>
+        </w:rPr>
+      </w:pPr>
+      <w:r>
+        <w:rPr>
+          <w:rStyle w:val="CodeHTML"/>
+        </w:rPr>
+        <w:t>php artisan make:model Contact -mcr</w:t>
+      </w:r>
+    </w:p>
+    <w:p>
+      <w:pPr>
+        <w:pStyle w:val="NormalWeb"/>
+      </w:pPr>
+      <w:r>
+        <w:t>Tu auras :</w:t>
+      </w:r>
+    </w:p>
+    <w:p>
+      <w:pPr>
+        <w:pStyle w:val="NormalWeb"/>
+        <w:numPr>
+          <w:ilvl w:val="0"/>
+          <w:numId w:val="4"/>
+        </w:numPr>
+      </w:pPr>
+      <w:r>
+        <w:rPr>
+          <w:rStyle w:val="CodeHTML"/>
+        </w:rPr>
+        <w:t>Model</w:t>
+      </w:r>
+      <w:r>
+        <w:t xml:space="preserve"> (ex: </w:t>
+      </w:r>
+      <w:r>
+        <w:rPr>
+          <w:rStyle w:val="CodeHTML"/>
+        </w:rPr>
+        <w:t>Service.php</w:t>
+      </w:r>
+      <w:r>
+        <w:t>)</w:t>
+      </w:r>
+    </w:p>
+    <w:p>
+      <w:pPr>
+        <w:pStyle w:val="NormalWeb"/>
+        <w:numPr>
+          <w:ilvl w:val="0"/>
+          <w:numId w:val="4"/>
+        </w:numPr>
+      </w:pPr>
+      <w:r>
+        <w:rPr>
+          <w:rStyle w:val="CodeHTML"/>
+        </w:rPr>
+        <w:t>Migration</w:t>
+      </w:r>
+      <w:r>
+        <w:t xml:space="preserve"> (structure DB)</w:t>
+      </w:r>
+    </w:p>
+    <w:p>
+      <w:pPr>
+        <w:pStyle w:val="NormalWeb"/>
+        <w:numPr>
+          <w:ilvl w:val="0"/>
+          <w:numId w:val="4"/>
+        </w:numPr>
+      </w:pPr>
+      <w:r>
+        <w:rPr>
+          <w:rStyle w:val="CodeHTML"/>
+        </w:rPr>
+        <w:t>Controller</w:t>
+      </w:r>
+      <w:r>
+        <w:t xml:space="preserve"> (logique métier)</w:t>
+      </w:r>
+    </w:p>
+    <w:p>
+      <w:pPr>
+        <w:pStyle w:val="NormalWeb"/>
+        <w:numPr>
+          <w:ilvl w:val="0"/>
+          <w:numId w:val="4"/>
+        </w:numPr>
+      </w:pPr>
+      <w:r>
+        <w:rPr>
+          <w:rStyle w:val="CodeHTML"/>
+        </w:rPr>
+        <w:t>Resource</w:t>
+      </w:r>
+      <w:r>
+        <w:t xml:space="preserve"> pour les routes REST si besoin</w:t>
+      </w:r>
+    </w:p>
+    <w:p>
+      <w:r>
+        <w:pict>
+          <v:rect id="_x0000_i1028" style="width:0;height:1.5pt" o:hralign="center" o:hrstd="t" o:hr="t" fillcolor="#a0a0a0" stroked="f"/>
+        </w:pict>
+      </w:r>
+    </w:p>
+    <w:p>
+      <w:pPr>
+        <w:pStyle w:val="Titre2"/>
+      </w:pPr>
+      <w:r>
+        <w:rPr>
+          <w:rFonts w:ascii="Cambria" w:hAnsi="Cambria" w:cs="Cambria"/>
+        </w:rPr>
+        <w:t>🔄</w:t>
+      </w:r>
+      <w:r>
+        <w:t xml:space="preserve"> 4. Les routes simples (</w:t>
+      </w:r>
+      <w:r>
+        <w:rPr>
+          <w:rStyle w:val="CodeHTML"/>
+          <w:rFonts w:eastAsiaTheme="majorEastAsia"/>
+        </w:rPr>
+        <w:t>web.php</w:t>
+      </w:r>
+      <w:r>
+        <w:t>)</w:t>
+      </w:r>
+    </w:p>
+    <w:p>
+      <w:pPr>
+        <w:pStyle w:val="PrformatHTML"/>
+      </w:pPr>
+      <w:r>
+        <w:t>php</w:t>
+      </w:r>
+    </w:p>
+    <w:p>
+      <w:pPr>
+        <w:pStyle w:val="PrformatHTML"/>
+      </w:pPr>
+      <w:r>
+        <w:t>CopierModifier</w:t>
+      </w:r>
+    </w:p>
+    <w:p>
+      <w:pPr>
+        <w:pStyle w:val="PrformatHTML"/>
+        <w:rPr>
+          <w:rStyle w:val="CodeHTML"/>
+        </w:rPr>
+      </w:pPr>
+      <w:r>
+        <w:rPr>
+          <w:rStyle w:val="hljs-title"/>
+        </w:rPr>
+        <w:t>Route</w:t>
+      </w:r>
+      <w:r>
+        <w:rPr>
+          <w:rStyle w:val="CodeHTML"/>
+        </w:rPr>
+        <w:t>::</w:t>
+      </w:r>
+      <w:r>
+        <w:rPr>
+          <w:rStyle w:val="hljs-title"/>
+        </w:rPr>
+        <w:t>get</w:t>
+      </w:r>
+      <w:r>
+        <w:rPr>
+          <w:rStyle w:val="CodeHTML"/>
+        </w:rPr>
+        <w:t>(</w:t>
+      </w:r>
+      <w:r>
+        <w:rPr>
+          <w:rStyle w:val="hljs-string"/>
+        </w:rPr>
+        <w:t>'/'</w:t>
+      </w:r>
+      <w:r>
+        <w:rPr>
+          <w:rStyle w:val="CodeHTML"/>
+        </w:rPr>
+        <w:t>, [</w:t>
+      </w:r>
+      <w:r>
+        <w:rPr>
+          <w:rStyle w:val="hljs-title"/>
+        </w:rPr>
+        <w:t>HomeController</w:t>
+      </w:r>
+      <w:r>
+        <w:rPr>
+          <w:rStyle w:val="CodeHTML"/>
+        </w:rPr>
+        <w:t>::</w:t>
+      </w:r>
+      <w:r>
+        <w:rPr>
+          <w:rStyle w:val="hljs-variable"/>
+        </w:rPr>
+        <w:t>class</w:t>
+      </w:r>
+      <w:r>
+        <w:rPr>
+          <w:rStyle w:val="CodeHTML"/>
+        </w:rPr>
+        <w:t xml:space="preserve">, </w:t>
+      </w:r>
+      <w:r>
+        <w:rPr>
+          <w:rStyle w:val="hljs-string"/>
+        </w:rPr>
+        <w:t>'index'</w:t>
+      </w:r>
+      <w:r>
+        <w:rPr>
+          <w:rStyle w:val="CodeHTML"/>
+        </w:rPr>
+        <w:t>])-&gt;</w:t>
+      </w:r>
+      <w:r>
+        <w:rPr>
+          <w:rStyle w:val="hljs-title"/>
+        </w:rPr>
+        <w:t>name</w:t>
+      </w:r>
+      <w:r>
+        <w:rPr>
+          <w:rStyle w:val="CodeHTML"/>
+        </w:rPr>
+        <w:t>(</w:t>
+      </w:r>
+      <w:r>
+        <w:rPr>
+          <w:rStyle w:val="hljs-string"/>
+        </w:rPr>
+        <w:t>'home'</w:t>
+      </w:r>
+      <w:r>
+        <w:rPr>
+          <w:rStyle w:val="CodeHTML"/>
+        </w:rPr>
+        <w:t>);</w:t>
+      </w:r>
+    </w:p>
+    <w:p>
+      <w:pPr>
+        <w:pStyle w:val="PrformatHTML"/>
+        <w:rPr>
+          <w:rStyle w:val="CodeHTML"/>
+        </w:rPr>
+      </w:pPr>
+    </w:p>
+    <w:p>
+      <w:pPr>
+        <w:pStyle w:val="PrformatHTML"/>
+        <w:rPr>
+          <w:rStyle w:val="CodeHTML"/>
+        </w:rPr>
+      </w:pPr>
+      <w:r>
+        <w:rPr>
+          <w:rStyle w:val="hljs-title"/>
+        </w:rPr>
+        <w:t>Route</w:t>
+      </w:r>
+      <w:r>
+        <w:rPr>
+          <w:rStyle w:val="CodeHTML"/>
+        </w:rPr>
+        <w:t>::</w:t>
+      </w:r>
+      <w:r>
+        <w:rPr>
+          <w:rStyle w:val="hljs-title"/>
+        </w:rPr>
+        <w:t>get</w:t>
+      </w:r>
+      <w:r>
+        <w:rPr>
+          <w:rStyle w:val="CodeHTML"/>
+        </w:rPr>
+        <w:t>(</w:t>
+      </w:r>
+      <w:r>
+        <w:rPr>
+          <w:rStyle w:val="hljs-string"/>
+        </w:rPr>
+        <w:t>'/services'</w:t>
+      </w:r>
+      <w:r>
+        <w:rPr>
+          <w:rStyle w:val="CodeHTML"/>
+        </w:rPr>
+        <w:t>, [</w:t>
+      </w:r>
+      <w:r>
+        <w:rPr>
+          <w:rStyle w:val="hljs-title"/>
+        </w:rPr>
+        <w:t>ServiceController</w:t>
+      </w:r>
+      <w:r>
+        <w:rPr>
+          <w:rStyle w:val="CodeHTML"/>
+        </w:rPr>
+        <w:t>::</w:t>
+      </w:r>
+      <w:r>
+        <w:rPr>
+          <w:rStyle w:val="hljs-variable"/>
+        </w:rPr>
+        <w:t>class</w:t>
+      </w:r>
+      <w:r>
+        <w:rPr>
+          <w:rStyle w:val="CodeHTML"/>
+        </w:rPr>
+        <w:t xml:space="preserve">, </w:t>
+      </w:r>
+      <w:r>
+        <w:rPr>
+          <w:rStyle w:val="hljs-string"/>
+        </w:rPr>
+        <w:t>'index'</w:t>
+      </w:r>
+      <w:r>
+        <w:rPr>
+          <w:rStyle w:val="CodeHTML"/>
+        </w:rPr>
+        <w:t>])-&gt;</w:t>
+      </w:r>
+      <w:r>
+        <w:rPr>
+          <w:rStyle w:val="hljs-title"/>
+        </w:rPr>
+        <w:t>name</w:t>
+      </w:r>
+      <w:r>
+        <w:rPr>
+          <w:rStyle w:val="CodeHTML"/>
+        </w:rPr>
+        <w:t>(</w:t>
+      </w:r>
+      <w:r>
+        <w:rPr>
+          <w:rStyle w:val="hljs-string"/>
+        </w:rPr>
+        <w:t>'services.index'</w:t>
+      </w:r>
+      <w:r>
+        <w:rPr>
+          <w:rStyle w:val="CodeHTML"/>
+        </w:rPr>
+        <w:t>);</w:t>
+      </w:r>
+    </w:p>
+    <w:p>
+      <w:pPr>
+        <w:pStyle w:val="PrformatHTML"/>
+        <w:rPr>
+          <w:rStyle w:val="CodeHTML"/>
+        </w:rPr>
+      </w:pPr>
+      <w:r>
+        <w:rPr>
+          <w:rStyle w:val="hljs-title"/>
+        </w:rPr>
+        <w:t>Route</w:t>
+      </w:r>
+      <w:r>
+        <w:rPr>
+          <w:rStyle w:val="CodeHTML"/>
+        </w:rPr>
+        <w:t>::</w:t>
+      </w:r>
+      <w:r>
+        <w:rPr>
+          <w:rStyle w:val="hljs-title"/>
+        </w:rPr>
+        <w:t>get</w:t>
+      </w:r>
+      <w:r>
+        <w:rPr>
+          <w:rStyle w:val="CodeHTML"/>
+        </w:rPr>
+        <w:t>(</w:t>
+      </w:r>
+      <w:r>
+        <w:rPr>
+          <w:rStyle w:val="hljs-string"/>
+        </w:rPr>
+        <w:t>'/projets'</w:t>
+      </w:r>
+      <w:r>
+        <w:rPr>
+          <w:rStyle w:val="CodeHTML"/>
+        </w:rPr>
+        <w:t>, [</w:t>
+      </w:r>
+      <w:r>
+        <w:rPr>
+          <w:rStyle w:val="hljs-title"/>
+        </w:rPr>
+        <w:t>ProjectController</w:t>
+      </w:r>
+      <w:r>
+        <w:rPr>
+          <w:rStyle w:val="CodeHTML"/>
+        </w:rPr>
+        <w:t>::</w:t>
+      </w:r>
+      <w:r>
+        <w:rPr>
+          <w:rStyle w:val="hljs-variable"/>
+        </w:rPr>
+        <w:t>class</w:t>
+      </w:r>
+      <w:r>
+        <w:rPr>
+          <w:rStyle w:val="CodeHTML"/>
+        </w:rPr>
+        <w:t xml:space="preserve">, </w:t>
+      </w:r>
+      <w:r>
+        <w:rPr>
+          <w:rStyle w:val="hljs-string"/>
+        </w:rPr>
+        <w:t>'index'</w:t>
+      </w:r>
+      <w:r>
+        <w:rPr>
+          <w:rStyle w:val="CodeHTML"/>
+        </w:rPr>
+        <w:t>])-&gt;</w:t>
+      </w:r>
+      <w:r>
+        <w:rPr>
+          <w:rStyle w:val="hljs-title"/>
+        </w:rPr>
+        <w:t>name</w:t>
+      </w:r>
+      <w:r>
+        <w:rPr>
+          <w:rStyle w:val="CodeHTML"/>
+        </w:rPr>
+        <w:t>(</w:t>
+      </w:r>
+      <w:r>
+        <w:rPr>
+          <w:rStyle w:val="hljs-string"/>
+        </w:rPr>
+        <w:t>'projects.index'</w:t>
+      </w:r>
+      <w:r>
+        <w:rPr>
+          <w:rStyle w:val="CodeHTML"/>
+        </w:rPr>
+        <w:t>);</w:t>
+      </w:r>
+    </w:p>
+    <w:p>
+      <w:pPr>
+        <w:pStyle w:val="PrformatHTML"/>
+        <w:rPr>
+          <w:rStyle w:val="CodeHTML"/>
+        </w:rPr>
+      </w:pPr>
+    </w:p>
+    <w:p>
+      <w:pPr>
+        <w:pStyle w:val="PrformatHTML"/>
+        <w:rPr>
+          <w:rStyle w:val="CodeHTML"/>
+        </w:rPr>
+      </w:pPr>
+      <w:r>
+        <w:rPr>
+          <w:rStyle w:val="hljs-title"/>
+        </w:rPr>
+        <w:t>Route</w:t>
+      </w:r>
+      <w:r>
+        <w:rPr>
+          <w:rStyle w:val="CodeHTML"/>
+        </w:rPr>
+        <w:t>::</w:t>
+      </w:r>
+      <w:r>
+        <w:rPr>
+          <w:rStyle w:val="hljs-title"/>
+        </w:rPr>
+        <w:t>get</w:t>
+      </w:r>
+      <w:r>
+        <w:rPr>
+          <w:rStyle w:val="CodeHTML"/>
+        </w:rPr>
+        <w:t>(</w:t>
+      </w:r>
+      <w:r>
+        <w:rPr>
+          <w:rStyle w:val="hljs-string"/>
+        </w:rPr>
+        <w:t>'/contact'</w:t>
+      </w:r>
+      <w:r>
+        <w:rPr>
+          <w:rStyle w:val="CodeHTML"/>
+        </w:rPr>
+        <w:t>, [</w:t>
+      </w:r>
+      <w:r>
+        <w:rPr>
+          <w:rStyle w:val="hljs-title"/>
+        </w:rPr>
+        <w:t>ContactController</w:t>
+      </w:r>
+      <w:r>
+        <w:rPr>
+          <w:rStyle w:val="CodeHTML"/>
+        </w:rPr>
+        <w:t>::</w:t>
+      </w:r>
+      <w:r>
+        <w:rPr>
+          <w:rStyle w:val="hljs-variable"/>
+        </w:rPr>
+        <w:t>class</w:t>
+      </w:r>
+      <w:r>
+        <w:rPr>
+          <w:rStyle w:val="CodeHTML"/>
+        </w:rPr>
+        <w:t xml:space="preserve">, </w:t>
+      </w:r>
+      <w:r>
+        <w:rPr>
+          <w:rStyle w:val="hljs-string"/>
+        </w:rPr>
+        <w:t>'create'</w:t>
+      </w:r>
+      <w:r>
+        <w:rPr>
+          <w:rStyle w:val="CodeHTML"/>
+        </w:rPr>
+        <w:t>])-&gt;</w:t>
+      </w:r>
+      <w:r>
+        <w:rPr>
+          <w:rStyle w:val="hljs-title"/>
+        </w:rPr>
+        <w:t>name</w:t>
+      </w:r>
+      <w:r>
+        <w:rPr>
+          <w:rStyle w:val="CodeHTML"/>
+        </w:rPr>
+        <w:t>(</w:t>
+      </w:r>
+      <w:r>
+        <w:rPr>
+          <w:rStyle w:val="hljs-string"/>
+        </w:rPr>
+        <w:t>'contact.create'</w:t>
+      </w:r>
+      <w:r>
+        <w:rPr>
+          <w:rStyle w:val="CodeHTML"/>
+        </w:rPr>
+        <w:t>);</w:t>
+      </w:r>
+    </w:p>
+    <w:p>
+      <w:pPr>
+        <w:pStyle w:val="PrformatHTML"/>
+        <w:rPr>
+          <w:rStyle w:val="CodeHTML"/>
+        </w:rPr>
+      </w:pPr>
+      <w:r>
+        <w:rPr>
+          <w:rStyle w:val="hljs-title"/>
+        </w:rPr>
+        <w:t>Route</w:t>
+      </w:r>
+      <w:r>
+        <w:rPr>
+          <w:rStyle w:val="CodeHTML"/>
+        </w:rPr>
+        <w:t>::</w:t>
+      </w:r>
+      <w:r>
+        <w:rPr>
+          <w:rStyle w:val="hljs-title"/>
+        </w:rPr>
+        <w:t>post</w:t>
+      </w:r>
+      <w:r>
+        <w:rPr>
+          <w:rStyle w:val="CodeHTML"/>
+        </w:rPr>
+        <w:t>(</w:t>
+      </w:r>
+      <w:r>
+        <w:rPr>
+          <w:rStyle w:val="hljs-string"/>
+        </w:rPr>
+        <w:t>'/contact'</w:t>
+      </w:r>
+      <w:r>
+        <w:rPr>
+          <w:rStyle w:val="CodeHTML"/>
+        </w:rPr>
+        <w:t>, [</w:t>
+      </w:r>
+      <w:r>
+        <w:rPr>
+          <w:rStyle w:val="hljs-title"/>
+        </w:rPr>
+        <w:t>ContactController</w:t>
+      </w:r>
+      <w:r>
+        <w:rPr>
+          <w:rStyle w:val="CodeHTML"/>
+        </w:rPr>
+        <w:t>::</w:t>
+      </w:r>
+      <w:r>
+        <w:rPr>
+          <w:rStyle w:val="hljs-variable"/>
+        </w:rPr>
+        <w:t>class</w:t>
+      </w:r>
+      <w:r>
+        <w:rPr>
+          <w:rStyle w:val="CodeHTML"/>
+        </w:rPr>
+        <w:t xml:space="preserve">, </w:t>
+      </w:r>
+      <w:r>
+        <w:rPr>
+          <w:rStyle w:val="hljs-string"/>
+        </w:rPr>
+        <w:t>'store'</w:t>
+      </w:r>
+      <w:r>
+        <w:rPr>
+          <w:rStyle w:val="CodeHTML"/>
+        </w:rPr>
+        <w:t>])-&gt;</w:t>
+      </w:r>
+      <w:r>
+        <w:rPr>
+          <w:rStyle w:val="hljs-title"/>
+        </w:rPr>
+        <w:t>name</w:t>
+      </w:r>
+      <w:r>
+        <w:rPr>
+          <w:rStyle w:val="CodeHTML"/>
+        </w:rPr>
+        <w:t>(</w:t>
+      </w:r>
+      <w:r>
+        <w:rPr>
+          <w:rStyle w:val="hljs-string"/>
+        </w:rPr>
+        <w:t>'contact.store'</w:t>
+      </w:r>
+      <w:r>
+        <w:rPr>
+          <w:rStyle w:val="CodeHTML"/>
+        </w:rPr>
+        <w:t>);</w:t>
+      </w:r>
+    </w:p>
+    <w:p>
+      <w:r>
+        <w:pict>
+          <v:rect id="_x0000_i1029" style="width:0;height:1.5pt" o:hralign="center" o:hrstd="t" o:hr="t" fillcolor="#a0a0a0" stroked="f"/>
+        </w:pict>
+      </w:r>
+    </w:p>
+    <w:p>
+      <w:pPr>
+        <w:pStyle w:val="Titre2"/>
+      </w:pPr>
+      <w:r>
+        <w:rPr>
+          <w:rFonts w:ascii="Cambria" w:hAnsi="Cambria" w:cs="Cambria"/>
+        </w:rPr>
+        <w:t>🧠</w:t>
+      </w:r>
+      <w:r>
+        <w:t xml:space="preserve"> 5. Les requêtes essentielles (dans les contrôleurs)</w:t>
+      </w:r>
+    </w:p>
+    <w:p>
+      <w:pPr>
+        <w:pStyle w:val="Titre3"/>
+      </w:pPr>
+      <w:r>
+        <w:t xml:space="preserve">Exemple </w:t>
+      </w:r>
+      <w:r>
+        <w:rPr>
+          <w:rStyle w:val="CodeHTML"/>
+        </w:rPr>
+        <w:t>ServiceController</w:t>
+      </w:r>
+      <w:r>
+        <w:t xml:space="preserve"> :</w:t>
+      </w:r>
+    </w:p>
+    <w:p>
+      <w:pPr>
+        <w:pStyle w:val="PrformatHTML"/>
+      </w:pPr>
+      <w:r>
+        <w:t>php</w:t>
+      </w:r>
+    </w:p>
+    <w:p>
+      <w:pPr>
+        <w:pStyle w:val="PrformatHTML"/>
+      </w:pPr>
+      <w:r>
+        <w:t>CopierModifier</w:t>
+      </w:r>
+    </w:p>
+    <w:p>
+      <w:pPr>
+        <w:pStyle w:val="PrformatHTML"/>
+        <w:rPr>
+          <w:rStyle w:val="CodeHTML"/>
+        </w:rPr>
+      </w:pPr>
+      <w:r>
+        <w:rPr>
+          <w:rStyle w:val="hljs-keyword"/>
+        </w:rPr>
+        <w:t>public</w:t>
+      </w:r>
+      <w:r>
+        <w:rPr>
+          <w:rStyle w:val="CodeHTML"/>
+        </w:rPr>
+        <w:t xml:space="preserve"> </w:t>
+      </w:r>
+      <w:r>
+        <w:rPr>
+          <w:rStyle w:val="hljs-keyword"/>
+        </w:rPr>
+        <w:t>function</w:t>
+      </w:r>
+      <w:r>
+        <w:rPr>
+          <w:rStyle w:val="CodeHTML"/>
+        </w:rPr>
+        <w:t xml:space="preserve"> </w:t>
+      </w:r>
+      <w:r>
+        <w:rPr>
+          <w:rStyle w:val="hljs-title"/>
+        </w:rPr>
+        <w:t>index</w:t>
+      </w:r>
+      <w:r>
+        <w:rPr>
+          <w:rStyle w:val="CodeHTML"/>
+        </w:rPr>
+        <w:t>()</w:t>
+      </w:r>
+    </w:p>
+    <w:p>
+      <w:pPr>
+        <w:pStyle w:val="PrformatHTML"/>
+        <w:rPr>
+          <w:rStyle w:val="CodeHTML"/>
+        </w:rPr>
+      </w:pPr>
+      <w:r>
+        <w:rPr>
+          <w:rStyle w:val="CodeHTML"/>
+        </w:rPr>
+        <w:t>{</w:t>
+      </w:r>
+    </w:p>
+    <w:p>
+      <w:pPr>
+        <w:pStyle w:val="PrformatHTML"/>
+        <w:rPr>
+          <w:rStyle w:val="CodeHTML"/>
+        </w:rPr>
+      </w:pPr>
+      <w:r>
+        <w:rPr>
+          <w:rStyle w:val="CodeHTML"/>
+        </w:rPr>
+        <w:t xml:space="preserve">    </w:t>
+      </w:r>
+      <w:r>
+        <w:rPr>
+          <w:rStyle w:val="hljs-variable"/>
+        </w:rPr>
+        <w:t>$services</w:t>
+      </w:r>
+      <w:r>
+        <w:rPr>
+          <w:rStyle w:val="CodeHTML"/>
+        </w:rPr>
+        <w:t xml:space="preserve"> = </w:t>
+      </w:r>
+      <w:r>
+        <w:rPr>
+          <w:rStyle w:val="hljs-title"/>
+        </w:rPr>
+        <w:t>Service</w:t>
+      </w:r>
+      <w:r>
+        <w:rPr>
+          <w:rStyle w:val="CodeHTML"/>
+        </w:rPr>
+        <w:t>::</w:t>
+      </w:r>
+      <w:r>
+        <w:rPr>
+          <w:rStyle w:val="hljs-title"/>
+        </w:rPr>
+        <w:t>all</w:t>
+      </w:r>
+      <w:r>
+        <w:rPr>
+          <w:rStyle w:val="CodeHTML"/>
+        </w:rPr>
+        <w:t>();</w:t>
+      </w:r>
+    </w:p>
+    <w:p>
+      <w:pPr>
+        <w:pStyle w:val="PrformatHTML"/>
+        <w:rPr>
+          <w:rStyle w:val="CodeHTML"/>
+        </w:rPr>
+      </w:pPr>
+      <w:r>
+        <w:rPr>
+          <w:rStyle w:val="CodeHTML"/>
+        </w:rPr>
+        <w:t xml:space="preserve">    </w:t>
+      </w:r>
+      <w:r>
+        <w:rPr>
+          <w:rStyle w:val="hljs-keyword"/>
+        </w:rPr>
+        <w:t>return</w:t>
+      </w:r>
+      <w:r>
+        <w:rPr>
+          <w:rStyle w:val="CodeHTML"/>
+        </w:rPr>
+        <w:t xml:space="preserve"> </w:t>
+      </w:r>
+      <w:r>
+        <w:rPr>
+          <w:rStyle w:val="hljs-title"/>
+        </w:rPr>
+        <w:t>view</w:t>
+      </w:r>
+      <w:r>
+        <w:rPr>
+          <w:rStyle w:val="CodeHTML"/>
+        </w:rPr>
+        <w:t>(</w:t>
+      </w:r>
+      <w:r>
+        <w:rPr>
+          <w:rStyle w:val="hljs-string"/>
+        </w:rPr>
+        <w:t>'services.index'</w:t>
+      </w:r>
+      <w:r>
+        <w:rPr>
+          <w:rStyle w:val="CodeHTML"/>
+        </w:rPr>
+        <w:t xml:space="preserve">, </w:t>
+      </w:r>
+      <w:r>
+        <w:rPr>
+          <w:rStyle w:val="hljs-title"/>
+        </w:rPr>
+        <w:t>compact</w:t>
+      </w:r>
+      <w:r>
+        <w:rPr>
+          <w:rStyle w:val="CodeHTML"/>
+        </w:rPr>
+        <w:t>(</w:t>
+      </w:r>
+      <w:r>
+        <w:rPr>
+          <w:rStyle w:val="hljs-string"/>
+        </w:rPr>
+        <w:t>'services'</w:t>
+      </w:r>
+      <w:r>
+        <w:rPr>
+          <w:rStyle w:val="CodeHTML"/>
+        </w:rPr>
+        <w:t>));</w:t>
+      </w:r>
+    </w:p>
+    <w:p>
+      <w:pPr>
+        <w:pStyle w:val="PrformatHTML"/>
+        <w:rPr>
+          <w:rStyle w:val="CodeHTML"/>
+        </w:rPr>
+      </w:pPr>
+      <w:r>
+        <w:rPr>
+          <w:rStyle w:val="CodeHTML"/>
+        </w:rPr>
+        <w:t>}</w:t>
+      </w:r>
+    </w:p>
+    <w:p>
+      <w:pPr>
+        <w:pStyle w:val="Titre3"/>
+      </w:pPr>
+      <w:r>
+        <w:t xml:space="preserve">Exemple </w:t>
+      </w:r>
+      <w:r>
+        <w:rPr>
+          <w:rStyle w:val="CodeHTML"/>
+        </w:rPr>
+        <w:t>ContactController</w:t>
+      </w:r>
+      <w:r>
+        <w:t xml:space="preserve"> (formulaire de contact) :</w:t>
+      </w:r>
+    </w:p>
+    <w:p>
+      <w:pPr>
+        <w:pStyle w:val="PrformatHTML"/>
+      </w:pPr>
+      <w:r>
+        <w:t>php</w:t>
+      </w:r>
+    </w:p>
+    <w:p>
+      <w:pPr>
+        <w:pStyle w:val="PrformatHTML"/>
+      </w:pPr>
+      <w:r>
+        <w:t>CopierModifier</w:t>
+      </w:r>
+    </w:p>
+    <w:p>
+      <w:pPr>
+        <w:pStyle w:val="PrformatHTML"/>
+        <w:rPr>
+          <w:rStyle w:val="CodeHTML"/>
+        </w:rPr>
+      </w:pPr>
+      <w:r>
+        <w:rPr>
+          <w:rStyle w:val="hljs-keyword"/>
+        </w:rPr>
+        <w:t>public</w:t>
+      </w:r>
+      <w:r>
+        <w:rPr>
+          <w:rStyle w:val="CodeHTML"/>
+        </w:rPr>
+        <w:t xml:space="preserve"> </w:t>
+      </w:r>
+      <w:r>
+        <w:rPr>
+          <w:rStyle w:val="hljs-keyword"/>
+        </w:rPr>
+        <w:t>function</w:t>
+      </w:r>
+      <w:r>
+        <w:rPr>
+          <w:rStyle w:val="CodeHTML"/>
+        </w:rPr>
+        <w:t xml:space="preserve"> </w:t>
+      </w:r>
+      <w:r>
+        <w:rPr>
+          <w:rStyle w:val="hljs-title"/>
+        </w:rPr>
+        <w:t>store</w:t>
+      </w:r>
+      <w:r>
+        <w:rPr>
+          <w:rStyle w:val="CodeHTML"/>
+        </w:rPr>
+        <w:t>(</w:t>
+      </w:r>
+      <w:r>
+        <w:rPr>
+          <w:rStyle w:val="hljs-params"/>
+        </w:rPr>
+        <w:t xml:space="preserve">Request </w:t>
+      </w:r>
+      <w:r>
+        <w:rPr>
+          <w:rStyle w:val="hljs-variable"/>
+        </w:rPr>
+        <w:t>$request</w:t>
+      </w:r>
+      <w:r>
+        <w:rPr>
+          <w:rStyle w:val="CodeHTML"/>
+        </w:rPr>
+        <w:t>)</w:t>
+      </w:r>
+    </w:p>
+    <w:p>
+      <w:pPr>
+        <w:pStyle w:val="PrformatHTML"/>
+        <w:rPr>
+          <w:rStyle w:val="CodeHTML"/>
+        </w:rPr>
+      </w:pPr>
+      <w:r>
+        <w:rPr>
+          <w:rStyle w:val="CodeHTML"/>
+        </w:rPr>
+        <w:t>{</w:t>
+      </w:r>
+    </w:p>
+    <w:p>
+      <w:pPr>
+        <w:pStyle w:val="PrformatHTML"/>
+        <w:rPr>
+          <w:rStyle w:val="CodeHTML"/>
+        </w:rPr>
+      </w:pPr>
+      <w:r>
+        <w:rPr>
+          <w:rStyle w:val="CodeHTML"/>
+        </w:rPr>
+        <w:t xml:space="preserve">    </w:t>
+      </w:r>
+      <w:r>
+        <w:rPr>
+          <w:rStyle w:val="hljs-title"/>
+        </w:rPr>
+        <w:t>Contact</w:t>
+      </w:r>
+      <w:r>
+        <w:rPr>
+          <w:rStyle w:val="CodeHTML"/>
+        </w:rPr>
+        <w:t>::</w:t>
+      </w:r>
+      <w:r>
+        <w:rPr>
+          <w:rStyle w:val="hljs-title"/>
+        </w:rPr>
+        <w:t>create</w:t>
+      </w:r>
+      <w:r>
+        <w:rPr>
+          <w:rStyle w:val="CodeHTML"/>
+        </w:rPr>
+        <w:t>(</w:t>
+      </w:r>
+      <w:r>
+        <w:rPr>
+          <w:rStyle w:val="hljs-variable"/>
+        </w:rPr>
+        <w:t>$request</w:t>
+      </w:r>
+      <w:r>
+        <w:rPr>
+          <w:rStyle w:val="CodeHTML"/>
+        </w:rPr>
+        <w:t>-&gt;</w:t>
+      </w:r>
+      <w:r>
+        <w:rPr>
+          <w:rStyle w:val="hljs-title"/>
+        </w:rPr>
+        <w:t>validate</w:t>
+      </w:r>
+      <w:r>
+        <w:rPr>
+          <w:rStyle w:val="CodeHTML"/>
+        </w:rPr>
+        <w:t>([</w:t>
+      </w:r>
+    </w:p>
+    <w:p>
+      <w:pPr>
+        <w:pStyle w:val="PrformatHTML"/>
+        <w:rPr>
+          <w:rStyle w:val="CodeHTML"/>
+        </w:rPr>
+      </w:pPr>
+      <w:r>
+        <w:rPr>
+          <w:rStyle w:val="CodeHTML"/>
+        </w:rPr>
+        <w:t xml:space="preserve">        </w:t>
+      </w:r>
+      <w:r>
+        <w:rPr>
+          <w:rStyle w:val="hljs-string"/>
+        </w:rPr>
+        <w:t>'nom'</w:t>
+      </w:r>
+      <w:r>
+        <w:rPr>
+          <w:rStyle w:val="CodeHTML"/>
+        </w:rPr>
+        <w:t xml:space="preserve"> =&gt; </w:t>
+      </w:r>
+      <w:r>
+        <w:rPr>
+          <w:rStyle w:val="hljs-string"/>
+        </w:rPr>
+        <w:t>'required|string'</w:t>
+      </w:r>
+      <w:r>
+        <w:rPr>
+          <w:rStyle w:val="CodeHTML"/>
+        </w:rPr>
+        <w:t>,</w:t>
+      </w:r>
+    </w:p>
+    <w:p>
+      <w:pPr>
+        <w:pStyle w:val="PrformatHTML"/>
+        <w:rPr>
+          <w:rStyle w:val="CodeHTML"/>
+        </w:rPr>
+      </w:pPr>
+      <w:r>
+        <w:rPr>
+          <w:rStyle w:val="CodeHTML"/>
+        </w:rPr>
+        <w:t xml:space="preserve">        </w:t>
+      </w:r>
+      <w:r>
+        <w:rPr>
+          <w:rStyle w:val="hljs-string"/>
+        </w:rPr>
+        <w:t>'email'</w:t>
+      </w:r>
+      <w:r>
+        <w:rPr>
+          <w:rStyle w:val="CodeHTML"/>
+        </w:rPr>
+        <w:t xml:space="preserve"> =&gt; </w:t>
+      </w:r>
+      <w:r>
+        <w:rPr>
+          <w:rStyle w:val="hljs-string"/>
+        </w:rPr>
+        <w:t>'required|email'</w:t>
+      </w:r>
+      <w:r>
+        <w:rPr>
+          <w:rStyle w:val="CodeHTML"/>
+        </w:rPr>
+        <w:t>,</w:t>
+      </w:r>
+    </w:p>
+    <w:p>
+      <w:pPr>
+        <w:pStyle w:val="PrformatHTML"/>
+        <w:rPr>
+          <w:rStyle w:val="CodeHTML"/>
+        </w:rPr>
+      </w:pPr>
+      <w:r>
+        <w:rPr>
+          <w:rStyle w:val="CodeHTML"/>
+        </w:rPr>
+        <w:t xml:space="preserve">        </w:t>
+      </w:r>
+      <w:r>
+        <w:rPr>
+          <w:rStyle w:val="hljs-string"/>
+        </w:rPr>
+        <w:t>'message'</w:t>
+      </w:r>
+      <w:r>
+        <w:rPr>
+          <w:rStyle w:val="CodeHTML"/>
+        </w:rPr>
+        <w:t xml:space="preserve"> =&gt; </w:t>
+      </w:r>
+      <w:r>
+        <w:rPr>
+          <w:rStyle w:val="hljs-string"/>
+        </w:rPr>
+        <w:t>'required|string|max:1000'</w:t>
+      </w:r>
+      <w:r>
+        <w:rPr>
+          <w:rStyle w:val="CodeHTML"/>
+        </w:rPr>
+        <w:t>,</w:t>
+      </w:r>
+    </w:p>
+    <w:p>
+      <w:pPr>
+        <w:pStyle w:val="PrformatHTML"/>
+        <w:rPr>
+          <w:rStyle w:val="CodeHTML"/>
+        </w:rPr>
+      </w:pPr>
+      <w:r>
+        <w:rPr>
+          <w:rStyle w:val="CodeHTML"/>
+        </w:rPr>
+        <w:t xml:space="preserve">    ]));</w:t>
+      </w:r>
+    </w:p>
+    <w:p>
+      <w:pPr>
+        <w:pStyle w:val="PrformatHTML"/>
+        <w:rPr>
+          <w:rStyle w:val="CodeHTML"/>
+        </w:rPr>
+      </w:pPr>
+    </w:p>
+    <w:p>
+      <w:pPr>
+        <w:pStyle w:val="PrformatHTML"/>
+        <w:rPr>
+          <w:rStyle w:val="CodeHTML"/>
+        </w:rPr>
+      </w:pPr>
+      <w:r>
+        <w:rPr>
+          <w:rStyle w:val="CodeHTML"/>
+        </w:rPr>
+        <w:t xml:space="preserve">    </w:t>
+      </w:r>
+      <w:r>
+        <w:rPr>
+          <w:rStyle w:val="hljs-keyword"/>
+        </w:rPr>
+        <w:t>return</w:t>
+      </w:r>
+      <w:r>
+        <w:rPr>
+          <w:rStyle w:val="CodeHTML"/>
+        </w:rPr>
+        <w:t xml:space="preserve"> </w:t>
+      </w:r>
+      <w:r>
+        <w:rPr>
+          <w:rStyle w:val="hljs-title"/>
+        </w:rPr>
+        <w:t>redirect</w:t>
+      </w:r>
+      <w:r>
+        <w:rPr>
+          <w:rStyle w:val="CodeHTML"/>
+        </w:rPr>
+        <w:t>()-&gt;</w:t>
+      </w:r>
+      <w:r>
+        <w:rPr>
+          <w:rStyle w:val="hljs-title"/>
+        </w:rPr>
+        <w:t>route</w:t>
+      </w:r>
+      <w:r>
+        <w:rPr>
+          <w:rStyle w:val="CodeHTML"/>
+        </w:rPr>
+        <w:t>(</w:t>
+      </w:r>
+      <w:r>
+        <w:rPr>
+          <w:rStyle w:val="hljs-string"/>
+        </w:rPr>
+        <w:t>'contact.create'</w:t>
+      </w:r>
+      <w:r>
+        <w:rPr>
+          <w:rStyle w:val="CodeHTML"/>
+        </w:rPr>
+        <w:t>)-&gt;</w:t>
+      </w:r>
+      <w:r>
+        <w:rPr>
+          <w:rStyle w:val="hljs-title"/>
+        </w:rPr>
+        <w:t>with</w:t>
+      </w:r>
+      <w:r>
+        <w:rPr>
+          <w:rStyle w:val="CodeHTML"/>
+        </w:rPr>
+        <w:t>(</w:t>
+      </w:r>
+      <w:r>
+        <w:rPr>
+          <w:rStyle w:val="hljs-string"/>
+        </w:rPr>
+        <w:t>'success'</w:t>
+      </w:r>
+      <w:r>
+        <w:rPr>
+          <w:rStyle w:val="CodeHTML"/>
+        </w:rPr>
+        <w:t xml:space="preserve">, </w:t>
+      </w:r>
+      <w:r>
+        <w:rPr>
+          <w:rStyle w:val="hljs-string"/>
+        </w:rPr>
+        <w:t>'Message envoyé !'</w:t>
+      </w:r>
+      <w:r>
+        <w:rPr>
+          <w:rStyle w:val="CodeHTML"/>
+        </w:rPr>
+        <w:t>);</w:t>
+      </w:r>
+    </w:p>
+    <w:p>
+      <w:pPr>
+        <w:pStyle w:val="PrformatHTML"/>
+        <w:rPr>
+          <w:rStyle w:val="CodeHTML"/>
+        </w:rPr>
+      </w:pPr>
+      <w:r>
+        <w:rPr>
+          <w:rStyle w:val="CodeHTML"/>
+        </w:rPr>
+        <w:t>}</w:t>
+      </w:r>
+    </w:p>
+    <w:p>
+      <w:r>
+        <w:pict>
+          <v:rect id="_x0000_i1030" style="width:0;height:1.5pt" o:hralign="center" o:hrstd="t" o:hr="t" fillcolor="#a0a0a0" stroked="f"/>
+        </w:pict>
+      </w:r>
+    </w:p>
+    <w:p>
+      <w:pPr>
+        <w:pStyle w:val="Titre2"/>
+      </w:pPr>
+      <w:r>
+        <w:rPr>
+          <w:rFonts w:ascii="Cambria" w:hAnsi="Cambria" w:cs="Cambria"/>
+        </w:rPr>
+        <w:lastRenderedPageBreak/>
+        <w:t>🎨</w:t>
+      </w:r>
+      <w:r>
+        <w:t xml:space="preserve"> 6. Vue côté front (Blade)</w:t>
+      </w:r>
+    </w:p>
+    <w:p>
+      <w:pPr>
+        <w:pStyle w:val="NormalWeb"/>
+      </w:pPr>
+      <w:r>
+        <w:t xml:space="preserve">Exemple minimal </w:t>
+      </w:r>
+      <w:r>
+        <w:rPr>
+          <w:rStyle w:val="CodeHTML"/>
+        </w:rPr>
+        <w:t>services/index.blade.php</w:t>
+      </w:r>
+      <w:r>
+        <w:t xml:space="preserve"> :</w:t>
+      </w:r>
+    </w:p>
+    <w:p>
+      <w:pPr>
+        <w:pStyle w:val="PrformatHTML"/>
+      </w:pPr>
+      <w:r>
+        <w:t>blade</w:t>
+      </w:r>
+    </w:p>
+    <w:p>
+      <w:pPr>
+        <w:pStyle w:val="PrformatHTML"/>
+      </w:pPr>
+      <w:r>
+        <w:t>CopierModifier</w:t>
+      </w:r>
+    </w:p>
+    <w:p>
+      <w:pPr>
+        <w:pStyle w:val="PrformatHTML"/>
+        <w:rPr>
+          <w:rStyle w:val="CodeHTML"/>
+        </w:rPr>
+      </w:pPr>
+      <w:r>
+        <w:rPr>
+          <w:rStyle w:val="CodeHTML"/>
+        </w:rPr>
+        <w:t>@foreach($services as $service)</w:t>
+      </w:r>
+    </w:p>
+    <w:p>
+      <w:pPr>
+        <w:pStyle w:val="PrformatHTML"/>
+        <w:rPr>
+          <w:rStyle w:val="CodeHTML"/>
+        </w:rPr>
+      </w:pPr>
+      <w:r>
+        <w:rPr>
+          <w:rStyle w:val="CodeHTML"/>
+        </w:rPr>
+        <w:t xml:space="preserve">  &lt;div&gt;</w:t>
+      </w:r>
+    </w:p>
+    <w:p>
+      <w:pPr>
+        <w:pStyle w:val="PrformatHTML"/>
+        <w:rPr>
+          <w:rStyle w:val="CodeHTML"/>
+        </w:rPr>
+      </w:pPr>
+      <w:r>
+        <w:rPr>
+          <w:rStyle w:val="CodeHTML"/>
+        </w:rPr>
+        <w:t xml:space="preserve">    &lt;h2&gt;{{ $service-&gt;titre }}&lt;/h2&gt;</w:t>
+      </w:r>
+    </w:p>
+    <w:p>
+      <w:pPr>
+        <w:pStyle w:val="PrformatHTML"/>
+        <w:rPr>
+          <w:rStyle w:val="CodeHTML"/>
+        </w:rPr>
+      </w:pPr>
+      <w:r>
+        <w:rPr>
+          <w:rStyle w:val="CodeHTML"/>
+        </w:rPr>
+        <w:t xml:space="preserve">    &lt;p&gt;{{ $service-&gt;description }}&lt;/p&gt;</w:t>
+      </w:r>
+    </w:p>
+    <w:p>
+      <w:pPr>
+        <w:pStyle w:val="PrformatHTML"/>
+        <w:rPr>
+          <w:rStyle w:val="CodeHTML"/>
+        </w:rPr>
+      </w:pPr>
+      <w:r>
+        <w:rPr>
+          <w:rStyle w:val="CodeHTML"/>
+        </w:rPr>
+        <w:t xml:space="preserve">    &lt;img src="{{ asset('storage/' . $service-&gt;image_path) }}" alt="{{ $service-&gt;titre }}"&gt;</w:t>
+      </w:r>
+    </w:p>
+    <w:p>
+      <w:pPr>
+        <w:pStyle w:val="PrformatHTML"/>
+        <w:rPr>
+          <w:rStyle w:val="CodeHTML"/>
+        </w:rPr>
+      </w:pPr>
+      <w:r>
+        <w:rPr>
+          <w:rStyle w:val="CodeHTML"/>
+        </w:rPr>
+        <w:t xml:space="preserve">  &lt;/div&gt;</w:t>
+      </w:r>
+    </w:p>
+    <w:p>
+      <w:pPr>
+        <w:pStyle w:val="PrformatHTML"/>
+        <w:rPr>
+          <w:rStyle w:val="CodeHTML"/>
+        </w:rPr>
+      </w:pPr>
+      <w:r>
+        <w:rPr>
+          <w:rStyle w:val="CodeHTML"/>
+        </w:rPr>
+        <w:t>@endforeach</w:t>
+      </w:r>
+    </w:p>
+    <w:p>
+      <w:r>
+        <w:pict>
+          <v:rect id="_x0000_i1031" style="width:0;height:1.5pt" o:hralign="center" o:hrstd="t" o:hr="t" fillcolor="#a0a0a0" stroked="f"/>
+        </w:pict>
+      </w:r>
+    </w:p>
+    <w:p>
+      <w:pPr>
+        <w:pStyle w:val="Titre2"/>
+      </w:pPr>
+      <w:r>
+        <w:rPr>
+          <w:rFonts w:ascii="Cambria" w:hAnsi="Cambria" w:cs="Cambria"/>
+        </w:rPr>
+        <w:t>🧪</w:t>
+      </w:r>
+      <w:r>
+        <w:t xml:space="preserve"> 7. Tester localement</w:t>
+      </w:r>
+    </w:p>
+    <w:p>
+      <w:pPr>
+        <w:pStyle w:val="PrformatHTML"/>
+      </w:pPr>
+      <w:r>
+        <w:t>bash</w:t>
+      </w:r>
+    </w:p>
+    <w:p>
+      <w:pPr>
+        <w:pStyle w:val="PrformatHTML"/>
+      </w:pPr>
+      <w:r>
+        <w:t>CopierModifier</w:t>
+      </w:r>
+    </w:p>
+    <w:p>
+      <w:pPr>
+        <w:pStyle w:val="PrformatHTML"/>
+        <w:rPr>
+          <w:rStyle w:val="CodeHTML"/>
+        </w:rPr>
+      </w:pPr>
+      <w:r>
+        <w:rPr>
+          <w:rStyle w:val="CodeHTML"/>
+        </w:rPr>
+        <w:t>php artisan migrate</w:t>
+      </w:r>
+    </w:p>
+    <w:p>
+      <w:pPr>
+        <w:pStyle w:val="PrformatHTML"/>
+        <w:rPr>
+          <w:rStyle w:val="CodeHTML"/>
+        </w:rPr>
+      </w:pPr>
+      <w:r>
+        <w:rPr>
+          <w:rStyle w:val="CodeHTML"/>
+        </w:rPr>
+        <w:t>php artisan serve</w:t>
+      </w:r>
+    </w:p>
+    <w:p>
+      <w:pPr>
+        <w:pStyle w:val="NormalWeb"/>
+      </w:pPr>
+      <w:r>
+        <w:t xml:space="preserve">Ajoute manuellement tes premiers services dans la base (via un </w:t>
+      </w:r>
+      <w:r>
+        <w:rPr>
+          <w:rStyle w:val="CodeHTML"/>
+        </w:rPr>
+        <w:t>seeder</w:t>
+      </w:r>
+      <w:r>
+        <w:t xml:space="preserve"> ou phpMyAdmin).</w:t>
+      </w:r>
+    </w:p>
+    <w:p>
+      <w:r>
+        <w:pict>
+          <v:rect id="_x0000_i1032" style="width:0;height:1.5pt" o:hralign="center" o:hrstd="t" o:hr="t" fillcolor="#a0a0a0" stroked="f"/>
+        </w:pict>
+      </w:r>
+    </w:p>
+    <w:p>
+      <w:pPr>
+        <w:pStyle w:val="Titre2"/>
+      </w:pPr>
+      <w:r>
+        <w:rPr>
+          <w:rFonts w:ascii="Cambria" w:hAnsi="Cambria" w:cs="Cambria"/>
+        </w:rPr>
+        <w:t>🚀</w:t>
+      </w:r>
+      <w:r>
+        <w:t xml:space="preserve"> Prochaines étapes</w:t>
+      </w:r>
+    </w:p>
+    <w:p>
+      <w:pPr>
+        <w:pStyle w:val="NormalWeb"/>
+        <w:numPr>
+          <w:ilvl w:val="0"/>
+          <w:numId w:val="5"/>
+        </w:numPr>
+      </w:pPr>
+      <w:r>
+        <w:t>Ajouter une interface admin plus tard (avec Jetstream, Filament ou Laravel Nova)</w:t>
+      </w:r>
+    </w:p>
+    <w:p>
+      <w:pPr>
+        <w:pStyle w:val="NormalWeb"/>
+        <w:numPr>
+          <w:ilvl w:val="0"/>
+          <w:numId w:val="5"/>
+        </w:numPr>
+      </w:pPr>
+      <w:r>
+        <w:t>Ajouter un portfolio dynamique</w:t>
+      </w:r>
+    </w:p>
+    <w:p>
+      <w:pPr>
+        <w:pStyle w:val="NormalWeb"/>
+        <w:numPr>
+          <w:ilvl w:val="0"/>
+          <w:numId w:val="5"/>
+        </w:numPr>
+      </w:pPr>
+      <w:r>
+        <w:t>Intégrer l’envoi d’email avec le formulaire</w:t>
+      </w:r>
+    </w:p>
+    <w:p>
+      <w:r>
+        <w:pict>
+          <v:rect id="_x0000_i1033" style="width:0;height:1.5pt" o:hralign="center" o:hrstd="t" o:hr="t" fillcolor="#a0a0a0" stroked="f"/>
+        </w:pict>
+      </w:r>
+    </w:p>
+    <w:p>
+      <w:pPr>
+        <w:pStyle w:val="NormalWeb"/>
+      </w:pPr>
+      <w:r>
+        <w:t xml:space="preserve">Souhaite-tu que je te prépare un exemple complet de </w:t>
+      </w:r>
+      <w:r>
+        <w:rPr>
+          <w:rStyle w:val="CodeHTML"/>
+        </w:rPr>
+        <w:t>ServiceController</w:t>
+      </w:r>
+      <w:r>
+        <w:t xml:space="preserve">, </w:t>
+      </w:r>
+      <w:r>
+        <w:rPr>
+          <w:rStyle w:val="CodeHTML"/>
+        </w:rPr>
+        <w:t>Vue</w:t>
+      </w:r>
+      <w:r>
+        <w:t xml:space="preserve">, </w:t>
+      </w:r>
+      <w:r>
+        <w:rPr>
+          <w:rStyle w:val="CodeHTML"/>
+        </w:rPr>
+        <w:t>Migration</w:t>
+      </w:r>
+      <w:r>
+        <w:t xml:space="preserve">, et </w:t>
+      </w:r>
+      <w:r>
+        <w:rPr>
+          <w:rStyle w:val="CodeHTML"/>
+        </w:rPr>
+        <w:t>Seeder</w:t>
+      </w:r>
+      <w:r>
+        <w:t xml:space="preserve"> ? Ou une version toute prête que tu peux copier-coller ?</w:t>
       </w:r>
     </w:p>
     <w:p>
@@ -1999,6 +4562,155 @@
 <file path=word/numbering.xml><?xml version="1.0" encoding="utf-8"?>
 <w:numbering xmlns:ve="http://schemas.openxmlformats.org/markup-compatibility/2006" xmlns:o="urn:schemas-microsoft-com:office:office" xmlns:r="http://schemas.openxmlformats.org/officeDocument/2006/relationships" xmlns:m="http://schemas.openxmlformats.org/officeDocument/2006/math" xmlns:v="urn:schemas-microsoft-com:vml" xmlns:wp="http://schemas.openxmlformats.org/drawingml/2006/wordprocessingDrawing" xmlns:w10="urn:schemas-microsoft-com:office:word" xmlns:w="http://schemas.openxmlformats.org/wordprocessingml/2006/main" xmlns:wne="http://schemas.microsoft.com/office/word/2006/wordml">
   <w:abstractNum w:abstractNumId="0">
+    <w:nsid w:val="14425F10"/>
+    <w:multiLevelType w:val="multilevel"/>
+    <w:tmpl w:val="77B603F4"/>
+    <w:lvl w:ilvl="0">
+      <w:start w:val="1"/>
+      <w:numFmt w:val="bullet"/>
+      <w:lvlText w:val=""/>
+      <w:lvlJc w:val="left"/>
+      <w:pPr>
+        <w:tabs>
+          <w:tab w:val="num" w:pos="720"/>
+        </w:tabs>
+        <w:ind w:left="720" w:hanging="360"/>
+      </w:pPr>
+      <w:rPr>
+        <w:rFonts w:ascii="Symbol" w:hAnsi="Symbol" w:hint="default"/>
+        <w:sz w:val="20"/>
+      </w:rPr>
+    </w:lvl>
+    <w:lvl w:ilvl="1" w:tentative="1">
+      <w:start w:val="1"/>
+      <w:numFmt w:val="bullet"/>
+      <w:lvlText w:val="o"/>
+      <w:lvlJc w:val="left"/>
+      <w:pPr>
+        <w:tabs>
+          <w:tab w:val="num" w:pos="1440"/>
+        </w:tabs>
+        <w:ind w:left="1440" w:hanging="360"/>
+      </w:pPr>
+      <w:rPr>
+        <w:rFonts w:ascii="Courier New" w:hAnsi="Courier New" w:hint="default"/>
+        <w:sz w:val="20"/>
+      </w:rPr>
+    </w:lvl>
+    <w:lvl w:ilvl="2" w:tentative="1">
+      <w:start w:val="1"/>
+      <w:numFmt w:val="bullet"/>
+      <w:lvlText w:val=""/>
+      <w:lvlJc w:val="left"/>
+      <w:pPr>
+        <w:tabs>
+          <w:tab w:val="num" w:pos="2160"/>
+        </w:tabs>
+        <w:ind w:left="2160" w:hanging="360"/>
+      </w:pPr>
+      <w:rPr>
+        <w:rFonts w:ascii="Wingdings" w:hAnsi="Wingdings" w:hint="default"/>
+        <w:sz w:val="20"/>
+      </w:rPr>
+    </w:lvl>
+    <w:lvl w:ilvl="3" w:tentative="1">
+      <w:start w:val="1"/>
+      <w:numFmt w:val="bullet"/>
+      <w:lvlText w:val=""/>
+      <w:lvlJc w:val="left"/>
+      <w:pPr>
+        <w:tabs>
+          <w:tab w:val="num" w:pos="2880"/>
+        </w:tabs>
+        <w:ind w:left="2880" w:hanging="360"/>
+      </w:pPr>
+      <w:rPr>
+        <w:rFonts w:ascii="Wingdings" w:hAnsi="Wingdings" w:hint="default"/>
+        <w:sz w:val="20"/>
+      </w:rPr>
+    </w:lvl>
+    <w:lvl w:ilvl="4" w:tentative="1">
+      <w:start w:val="1"/>
+      <w:numFmt w:val="bullet"/>
+      <w:lvlText w:val=""/>
+      <w:lvlJc w:val="left"/>
+      <w:pPr>
+        <w:tabs>
+          <w:tab w:val="num" w:pos="3600"/>
+        </w:tabs>
+        <w:ind w:left="3600" w:hanging="360"/>
+      </w:pPr>
+      <w:rPr>
+        <w:rFonts w:ascii="Wingdings" w:hAnsi="Wingdings" w:hint="default"/>
+        <w:sz w:val="20"/>
+      </w:rPr>
+    </w:lvl>
+    <w:lvl w:ilvl="5" w:tentative="1">
+      <w:start w:val="1"/>
+      <w:numFmt w:val="bullet"/>
+      <w:lvlText w:val=""/>
+      <w:lvlJc w:val="left"/>
+      <w:pPr>
+        <w:tabs>
+          <w:tab w:val="num" w:pos="4320"/>
+        </w:tabs>
+        <w:ind w:left="4320" w:hanging="360"/>
+      </w:pPr>
+      <w:rPr>
+        <w:rFonts w:ascii="Wingdings" w:hAnsi="Wingdings" w:hint="default"/>
+        <w:sz w:val="20"/>
+      </w:rPr>
+    </w:lvl>
+    <w:lvl w:ilvl="6" w:tentative="1">
+      <w:start w:val="1"/>
+      <w:numFmt w:val="bullet"/>
+      <w:lvlText w:val=""/>
+      <w:lvlJc w:val="left"/>
+      <w:pPr>
+        <w:tabs>
+          <w:tab w:val="num" w:pos="5040"/>
+        </w:tabs>
+        <w:ind w:left="5040" w:hanging="360"/>
+      </w:pPr>
+      <w:rPr>
+        <w:rFonts w:ascii="Wingdings" w:hAnsi="Wingdings" w:hint="default"/>
+        <w:sz w:val="20"/>
+      </w:rPr>
+    </w:lvl>
+    <w:lvl w:ilvl="7" w:tentative="1">
+      <w:start w:val="1"/>
+      <w:numFmt w:val="bullet"/>
+      <w:lvlText w:val=""/>
+      <w:lvlJc w:val="left"/>
+      <w:pPr>
+        <w:tabs>
+          <w:tab w:val="num" w:pos="5760"/>
+        </w:tabs>
+        <w:ind w:left="5760" w:hanging="360"/>
+      </w:pPr>
+      <w:rPr>
+        <w:rFonts w:ascii="Wingdings" w:hAnsi="Wingdings" w:hint="default"/>
+        <w:sz w:val="20"/>
+      </w:rPr>
+    </w:lvl>
+    <w:lvl w:ilvl="8" w:tentative="1">
+      <w:start w:val="1"/>
+      <w:numFmt w:val="bullet"/>
+      <w:lvlText w:val=""/>
+      <w:lvlJc w:val="left"/>
+      <w:pPr>
+        <w:tabs>
+          <w:tab w:val="num" w:pos="6480"/>
+        </w:tabs>
+        <w:ind w:left="6480" w:hanging="360"/>
+      </w:pPr>
+      <w:rPr>
+        <w:rFonts w:ascii="Wingdings" w:hAnsi="Wingdings" w:hint="default"/>
+        <w:sz w:val="20"/>
+      </w:rPr>
+    </w:lvl>
+  </w:abstractNum>
+  <w:abstractNum w:abstractNumId="1">
     <w:nsid w:val="421276B3"/>
     <w:multiLevelType w:val="multilevel"/>
     <w:tmpl w:val="1CF405B0"/>
@@ -2111,7 +4823,305 @@
       </w:pPr>
     </w:lvl>
   </w:abstractNum>
-  <w:abstractNum w:abstractNumId="1">
+  <w:abstractNum w:abstractNumId="2">
+    <w:nsid w:val="4B802B32"/>
+    <w:multiLevelType w:val="multilevel"/>
+    <w:tmpl w:val="CFCC6D84"/>
+    <w:lvl w:ilvl="0">
+      <w:start w:val="1"/>
+      <w:numFmt w:val="bullet"/>
+      <w:lvlText w:val=""/>
+      <w:lvlJc w:val="left"/>
+      <w:pPr>
+        <w:tabs>
+          <w:tab w:val="num" w:pos="720"/>
+        </w:tabs>
+        <w:ind w:left="720" w:hanging="360"/>
+      </w:pPr>
+      <w:rPr>
+        <w:rFonts w:ascii="Symbol" w:hAnsi="Symbol" w:hint="default"/>
+        <w:sz w:val="20"/>
+      </w:rPr>
+    </w:lvl>
+    <w:lvl w:ilvl="1" w:tentative="1">
+      <w:start w:val="1"/>
+      <w:numFmt w:val="bullet"/>
+      <w:lvlText w:val="o"/>
+      <w:lvlJc w:val="left"/>
+      <w:pPr>
+        <w:tabs>
+          <w:tab w:val="num" w:pos="1440"/>
+        </w:tabs>
+        <w:ind w:left="1440" w:hanging="360"/>
+      </w:pPr>
+      <w:rPr>
+        <w:rFonts w:ascii="Courier New" w:hAnsi="Courier New" w:hint="default"/>
+        <w:sz w:val="20"/>
+      </w:rPr>
+    </w:lvl>
+    <w:lvl w:ilvl="2" w:tentative="1">
+      <w:start w:val="1"/>
+      <w:numFmt w:val="bullet"/>
+      <w:lvlText w:val=""/>
+      <w:lvlJc w:val="left"/>
+      <w:pPr>
+        <w:tabs>
+          <w:tab w:val="num" w:pos="2160"/>
+        </w:tabs>
+        <w:ind w:left="2160" w:hanging="360"/>
+      </w:pPr>
+      <w:rPr>
+        <w:rFonts w:ascii="Wingdings" w:hAnsi="Wingdings" w:hint="default"/>
+        <w:sz w:val="20"/>
+      </w:rPr>
+    </w:lvl>
+    <w:lvl w:ilvl="3" w:tentative="1">
+      <w:start w:val="1"/>
+      <w:numFmt w:val="bullet"/>
+      <w:lvlText w:val=""/>
+      <w:lvlJc w:val="left"/>
+      <w:pPr>
+        <w:tabs>
+          <w:tab w:val="num" w:pos="2880"/>
+        </w:tabs>
+        <w:ind w:left="2880" w:hanging="360"/>
+      </w:pPr>
+      <w:rPr>
+        <w:rFonts w:ascii="Wingdings" w:hAnsi="Wingdings" w:hint="default"/>
+        <w:sz w:val="20"/>
+      </w:rPr>
+    </w:lvl>
+    <w:lvl w:ilvl="4" w:tentative="1">
+      <w:start w:val="1"/>
+      <w:numFmt w:val="bullet"/>
+      <w:lvlText w:val=""/>
+      <w:lvlJc w:val="left"/>
+      <w:pPr>
+        <w:tabs>
+          <w:tab w:val="num" w:pos="3600"/>
+        </w:tabs>
+        <w:ind w:left="3600" w:hanging="360"/>
+      </w:pPr>
+      <w:rPr>
+        <w:rFonts w:ascii="Wingdings" w:hAnsi="Wingdings" w:hint="default"/>
+        <w:sz w:val="20"/>
+      </w:rPr>
+    </w:lvl>
+    <w:lvl w:ilvl="5" w:tentative="1">
+      <w:start w:val="1"/>
+      <w:numFmt w:val="bullet"/>
+      <w:lvlText w:val=""/>
+      <w:lvlJc w:val="left"/>
+      <w:pPr>
+        <w:tabs>
+          <w:tab w:val="num" w:pos="4320"/>
+        </w:tabs>
+        <w:ind w:left="4320" w:hanging="360"/>
+      </w:pPr>
+      <w:rPr>
+        <w:rFonts w:ascii="Wingdings" w:hAnsi="Wingdings" w:hint="default"/>
+        <w:sz w:val="20"/>
+      </w:rPr>
+    </w:lvl>
+    <w:lvl w:ilvl="6" w:tentative="1">
+      <w:start w:val="1"/>
+      <w:numFmt w:val="bullet"/>
+      <w:lvlText w:val=""/>
+      <w:lvlJc w:val="left"/>
+      <w:pPr>
+        <w:tabs>
+          <w:tab w:val="num" w:pos="5040"/>
+        </w:tabs>
+        <w:ind w:left="5040" w:hanging="360"/>
+      </w:pPr>
+      <w:rPr>
+        <w:rFonts w:ascii="Wingdings" w:hAnsi="Wingdings" w:hint="default"/>
+        <w:sz w:val="20"/>
+      </w:rPr>
+    </w:lvl>
+    <w:lvl w:ilvl="7" w:tentative="1">
+      <w:start w:val="1"/>
+      <w:numFmt w:val="bullet"/>
+      <w:lvlText w:val=""/>
+      <w:lvlJc w:val="left"/>
+      <w:pPr>
+        <w:tabs>
+          <w:tab w:val="num" w:pos="5760"/>
+        </w:tabs>
+        <w:ind w:left="5760" w:hanging="360"/>
+      </w:pPr>
+      <w:rPr>
+        <w:rFonts w:ascii="Wingdings" w:hAnsi="Wingdings" w:hint="default"/>
+        <w:sz w:val="20"/>
+      </w:rPr>
+    </w:lvl>
+    <w:lvl w:ilvl="8" w:tentative="1">
+      <w:start w:val="1"/>
+      <w:numFmt w:val="bullet"/>
+      <w:lvlText w:val=""/>
+      <w:lvlJc w:val="left"/>
+      <w:pPr>
+        <w:tabs>
+          <w:tab w:val="num" w:pos="6480"/>
+        </w:tabs>
+        <w:ind w:left="6480" w:hanging="360"/>
+      </w:pPr>
+      <w:rPr>
+        <w:rFonts w:ascii="Wingdings" w:hAnsi="Wingdings" w:hint="default"/>
+        <w:sz w:val="20"/>
+      </w:rPr>
+    </w:lvl>
+  </w:abstractNum>
+  <w:abstractNum w:abstractNumId="3">
+    <w:nsid w:val="4D027B66"/>
+    <w:multiLevelType w:val="multilevel"/>
+    <w:tmpl w:val="85685B46"/>
+    <w:lvl w:ilvl="0">
+      <w:start w:val="1"/>
+      <w:numFmt w:val="bullet"/>
+      <w:lvlText w:val=""/>
+      <w:lvlJc w:val="left"/>
+      <w:pPr>
+        <w:tabs>
+          <w:tab w:val="num" w:pos="720"/>
+        </w:tabs>
+        <w:ind w:left="720" w:hanging="360"/>
+      </w:pPr>
+      <w:rPr>
+        <w:rFonts w:ascii="Symbol" w:hAnsi="Symbol" w:hint="default"/>
+        <w:sz w:val="20"/>
+      </w:rPr>
+    </w:lvl>
+    <w:lvl w:ilvl="1" w:tentative="1">
+      <w:start w:val="1"/>
+      <w:numFmt w:val="bullet"/>
+      <w:lvlText w:val="o"/>
+      <w:lvlJc w:val="left"/>
+      <w:pPr>
+        <w:tabs>
+          <w:tab w:val="num" w:pos="1440"/>
+        </w:tabs>
+        <w:ind w:left="1440" w:hanging="360"/>
+      </w:pPr>
+      <w:rPr>
+        <w:rFonts w:ascii="Courier New" w:hAnsi="Courier New" w:hint="default"/>
+        <w:sz w:val="20"/>
+      </w:rPr>
+    </w:lvl>
+    <w:lvl w:ilvl="2" w:tentative="1">
+      <w:start w:val="1"/>
+      <w:numFmt w:val="bullet"/>
+      <w:lvlText w:val=""/>
+      <w:lvlJc w:val="left"/>
+      <w:pPr>
+        <w:tabs>
+          <w:tab w:val="num" w:pos="2160"/>
+        </w:tabs>
+        <w:ind w:left="2160" w:hanging="360"/>
+      </w:pPr>
+      <w:rPr>
+        <w:rFonts w:ascii="Wingdings" w:hAnsi="Wingdings" w:hint="default"/>
+        <w:sz w:val="20"/>
+      </w:rPr>
+    </w:lvl>
+    <w:lvl w:ilvl="3" w:tentative="1">
+      <w:start w:val="1"/>
+      <w:numFmt w:val="bullet"/>
+      <w:lvlText w:val=""/>
+      <w:lvlJc w:val="left"/>
+      <w:pPr>
+        <w:tabs>
+          <w:tab w:val="num" w:pos="2880"/>
+        </w:tabs>
+        <w:ind w:left="2880" w:hanging="360"/>
+      </w:pPr>
+      <w:rPr>
+        <w:rFonts w:ascii="Wingdings" w:hAnsi="Wingdings" w:hint="default"/>
+        <w:sz w:val="20"/>
+      </w:rPr>
+    </w:lvl>
+    <w:lvl w:ilvl="4" w:tentative="1">
+      <w:start w:val="1"/>
+      <w:numFmt w:val="bullet"/>
+      <w:lvlText w:val=""/>
+      <w:lvlJc w:val="left"/>
+      <w:pPr>
+        <w:tabs>
+          <w:tab w:val="num" w:pos="3600"/>
+        </w:tabs>
+        <w:ind w:left="3600" w:hanging="360"/>
+      </w:pPr>
+      <w:rPr>
+        <w:rFonts w:ascii="Wingdings" w:hAnsi="Wingdings" w:hint="default"/>
+        <w:sz w:val="20"/>
+      </w:rPr>
+    </w:lvl>
+    <w:lvl w:ilvl="5" w:tentative="1">
+      <w:start w:val="1"/>
+      <w:numFmt w:val="bullet"/>
+      <w:lvlText w:val=""/>
+      <w:lvlJc w:val="left"/>
+      <w:pPr>
+        <w:tabs>
+          <w:tab w:val="num" w:pos="4320"/>
+        </w:tabs>
+        <w:ind w:left="4320" w:hanging="360"/>
+      </w:pPr>
+      <w:rPr>
+        <w:rFonts w:ascii="Wingdings" w:hAnsi="Wingdings" w:hint="default"/>
+        <w:sz w:val="20"/>
+      </w:rPr>
+    </w:lvl>
+    <w:lvl w:ilvl="6" w:tentative="1">
+      <w:start w:val="1"/>
+      <w:numFmt w:val="bullet"/>
+      <w:lvlText w:val=""/>
+      <w:lvlJc w:val="left"/>
+      <w:pPr>
+        <w:tabs>
+          <w:tab w:val="num" w:pos="5040"/>
+        </w:tabs>
+        <w:ind w:left="5040" w:hanging="360"/>
+      </w:pPr>
+      <w:rPr>
+        <w:rFonts w:ascii="Wingdings" w:hAnsi="Wingdings" w:hint="default"/>
+        <w:sz w:val="20"/>
+      </w:rPr>
+    </w:lvl>
+    <w:lvl w:ilvl="7" w:tentative="1">
+      <w:start w:val="1"/>
+      <w:numFmt w:val="bullet"/>
+      <w:lvlText w:val=""/>
+      <w:lvlJc w:val="left"/>
+      <w:pPr>
+        <w:tabs>
+          <w:tab w:val="num" w:pos="5760"/>
+        </w:tabs>
+        <w:ind w:left="5760" w:hanging="360"/>
+      </w:pPr>
+      <w:rPr>
+        <w:rFonts w:ascii="Wingdings" w:hAnsi="Wingdings" w:hint="default"/>
+        <w:sz w:val="20"/>
+      </w:rPr>
+    </w:lvl>
+    <w:lvl w:ilvl="8" w:tentative="1">
+      <w:start w:val="1"/>
+      <w:numFmt w:val="bullet"/>
+      <w:lvlText w:val=""/>
+      <w:lvlJc w:val="left"/>
+      <w:pPr>
+        <w:tabs>
+          <w:tab w:val="num" w:pos="6480"/>
+        </w:tabs>
+        <w:ind w:left="6480" w:hanging="360"/>
+      </w:pPr>
+      <w:rPr>
+        <w:rFonts w:ascii="Wingdings" w:hAnsi="Wingdings" w:hint="default"/>
+        <w:sz w:val="20"/>
+      </w:rPr>
+    </w:lvl>
+  </w:abstractNum>
+  <w:abstractNum w:abstractNumId="4">
     <w:nsid w:val="58AB5F64"/>
     <w:multiLevelType w:val="multilevel"/>
     <w:tmpl w:val="70D28B3C"/>
@@ -2225,10 +5235,19 @@
     </w:lvl>
   </w:abstractNum>
   <w:num w:numId="1">
+    <w:abstractNumId w:val="1"/>
+  </w:num>
+  <w:num w:numId="2">
+    <w:abstractNumId w:val="4"/>
+  </w:num>
+  <w:num w:numId="3">
+    <w:abstractNumId w:val="2"/>
+  </w:num>
+  <w:num w:numId="4">
     <w:abstractNumId w:val="0"/>
   </w:num>
-  <w:num w:numId="2">
-    <w:abstractNumId w:val="1"/>
+  <w:num w:numId="5">
+    <w:abstractNumId w:val="3"/>
   </w:num>
 </w:numbering>
 </file>
@@ -2394,6 +5413,31 @@
     <w:qFormat/>
     <w:rsid w:val="00FF3FF6"/>
   </w:style>
+  <w:style w:type="paragraph" w:styleId="Titre2">
+    <w:name w:val="heading 2"/>
+    <w:basedOn w:val="Normal"/>
+    <w:next w:val="Normal"/>
+    <w:link w:val="Titre2Car"/>
+    <w:uiPriority w:val="9"/>
+    <w:semiHidden/>
+    <w:unhideWhenUsed/>
+    <w:qFormat/>
+    <w:rsid w:val="004B5C39"/>
+    <w:pPr>
+      <w:keepNext/>
+      <w:keepLines/>
+      <w:spacing w:before="200" w:after="0"/>
+      <w:outlineLvl w:val="1"/>
+    </w:pPr>
+    <w:rPr>
+      <w:rFonts w:asciiTheme="majorHAnsi" w:eastAsiaTheme="majorEastAsia" w:hAnsiTheme="majorHAnsi" w:cstheme="majorBidi"/>
+      <w:b/>
+      <w:bCs/>
+      <w:color w:val="4F81BD" w:themeColor="accent1"/>
+      <w:sz w:val="26"/>
+      <w:szCs w:val="26"/>
+    </w:rPr>
+  </w:style>
   <w:style w:type="paragraph" w:styleId="Titre3">
     <w:name w:val="heading 3"/>
     <w:basedOn w:val="Normal"/>
@@ -2514,6 +5558,108 @@
       <w:b/>
       <w:bCs/>
     </w:rPr>
+  </w:style>
+  <w:style w:type="character" w:customStyle="1" w:styleId="Titre2Car">
+    <w:name w:val="Titre 2 Car"/>
+    <w:basedOn w:val="Policepardfaut"/>
+    <w:link w:val="Titre2"/>
+    <w:uiPriority w:val="9"/>
+    <w:semiHidden/>
+    <w:rsid w:val="004B5C39"/>
+    <w:rPr>
+      <w:rFonts w:asciiTheme="majorHAnsi" w:eastAsiaTheme="majorEastAsia" w:hAnsiTheme="majorHAnsi" w:cstheme="majorBidi"/>
+      <w:b/>
+      <w:bCs/>
+      <w:color w:val="4F81BD" w:themeColor="accent1"/>
+      <w:sz w:val="26"/>
+      <w:szCs w:val="26"/>
+    </w:rPr>
+  </w:style>
+  <w:style w:type="character" w:styleId="CodeHTML">
+    <w:name w:val="HTML Code"/>
+    <w:basedOn w:val="Policepardfaut"/>
+    <w:uiPriority w:val="99"/>
+    <w:semiHidden/>
+    <w:unhideWhenUsed/>
+    <w:rsid w:val="004B5C39"/>
+    <w:rPr>
+      <w:rFonts w:ascii="Courier New" w:eastAsia="Times New Roman" w:hAnsi="Courier New" w:cs="Courier New"/>
+      <w:sz w:val="20"/>
+      <w:szCs w:val="20"/>
+    </w:rPr>
+  </w:style>
+  <w:style w:type="paragraph" w:styleId="PrformatHTML">
+    <w:name w:val="HTML Preformatted"/>
+    <w:basedOn w:val="Normal"/>
+    <w:link w:val="PrformatHTMLCar"/>
+    <w:uiPriority w:val="99"/>
+    <w:semiHidden/>
+    <w:unhideWhenUsed/>
+    <w:rsid w:val="004B5C39"/>
+    <w:pPr>
+      <w:tabs>
+        <w:tab w:val="left" w:pos="916"/>
+        <w:tab w:val="left" w:pos="1832"/>
+        <w:tab w:val="left" w:pos="2748"/>
+        <w:tab w:val="left" w:pos="3664"/>
+        <w:tab w:val="left" w:pos="4580"/>
+        <w:tab w:val="left" w:pos="5496"/>
+        <w:tab w:val="left" w:pos="6412"/>
+        <w:tab w:val="left" w:pos="7328"/>
+        <w:tab w:val="left" w:pos="8244"/>
+        <w:tab w:val="left" w:pos="9160"/>
+        <w:tab w:val="left" w:pos="10076"/>
+        <w:tab w:val="left" w:pos="10992"/>
+        <w:tab w:val="left" w:pos="11908"/>
+        <w:tab w:val="left" w:pos="12824"/>
+        <w:tab w:val="left" w:pos="13740"/>
+        <w:tab w:val="left" w:pos="14656"/>
+      </w:tabs>
+      <w:spacing w:after="0" w:line="240" w:lineRule="auto"/>
+    </w:pPr>
+    <w:rPr>
+      <w:rFonts w:ascii="Courier New" w:eastAsia="Times New Roman" w:hAnsi="Courier New" w:cs="Courier New"/>
+      <w:sz w:val="20"/>
+      <w:szCs w:val="20"/>
+    </w:rPr>
+  </w:style>
+  <w:style w:type="character" w:customStyle="1" w:styleId="PrformatHTMLCar">
+    <w:name w:val="Préformaté HTML Car"/>
+    <w:basedOn w:val="Policepardfaut"/>
+    <w:link w:val="PrformatHTML"/>
+    <w:uiPriority w:val="99"/>
+    <w:semiHidden/>
+    <w:rsid w:val="004B5C39"/>
+    <w:rPr>
+      <w:rFonts w:ascii="Courier New" w:eastAsia="Times New Roman" w:hAnsi="Courier New" w:cs="Courier New"/>
+      <w:sz w:val="20"/>
+      <w:szCs w:val="20"/>
+    </w:rPr>
+  </w:style>
+  <w:style w:type="character" w:customStyle="1" w:styleId="hljs-title">
+    <w:name w:val="hljs-title"/>
+    <w:basedOn w:val="Policepardfaut"/>
+    <w:rsid w:val="004B5C39"/>
+  </w:style>
+  <w:style w:type="character" w:customStyle="1" w:styleId="hljs-string">
+    <w:name w:val="hljs-string"/>
+    <w:basedOn w:val="Policepardfaut"/>
+    <w:rsid w:val="004B5C39"/>
+  </w:style>
+  <w:style w:type="character" w:customStyle="1" w:styleId="hljs-variable">
+    <w:name w:val="hljs-variable"/>
+    <w:basedOn w:val="Policepardfaut"/>
+    <w:rsid w:val="004B5C39"/>
+  </w:style>
+  <w:style w:type="character" w:customStyle="1" w:styleId="hljs-keyword">
+    <w:name w:val="hljs-keyword"/>
+    <w:basedOn w:val="Policepardfaut"/>
+    <w:rsid w:val="004B5C39"/>
+  </w:style>
+  <w:style w:type="character" w:customStyle="1" w:styleId="hljs-params">
+    <w:name w:val="hljs-params"/>
+    <w:basedOn w:val="Policepardfaut"/>
+    <w:rsid w:val="004B5C39"/>
   </w:style>
 </w:styles>
 </file>

</xml_diff>